<commit_message>
docs: add running header to both docx reports
Name, document title, and page number on every page, derived from
each file's own heading so it stays in sync if the title changes.
Still exactly two pages each.
</commit_message>
<xml_diff>
--- a/report/report-toml-tomlc99.docx
+++ b/report/report-toml-tomlc99.docx
@@ -22,7 +22,7 @@
         </w:rPr>
         <w:t xml:space="preserve">Supplementary to </w:t>
       </w:r>
-      <w:hyperlink w:history="1" r:id="rIduwbzzxb2cjati-kip2e8e">
+      <w:hyperlink w:history="1" r:id="rIdizayyl7fvskwqsozdwhw3">
         <w:r>
           <w:rPr>
             <w:rStyle w:val="Hyperlink"/>
@@ -67,7 +67,7 @@
       <w:r>
         <w:t xml:space="preserve"> </w:t>
       </w:r>
-      <w:hyperlink w:history="1" r:id="rIdazblsqnz5z_y_46cq7lyx">
+      <w:hyperlink w:history="1" r:id="rIdsp2j3iggoinrdcznl9vhl">
         <w:r>
           <w:rPr>
             <w:rStyle w:val="Hyperlink"/>
@@ -1135,8 +1135,9 @@
       </w:r>
     </w:p>
     <w:sectPr>
+      <w:headerReference w:type="default" r:id="rId7"/>
       <w:pgSz w:w="12240" w:h="15840" w:orient="portrait"/>
-      <w:pgMar w:top="1440" w:right="1440" w:bottom="1440" w:left="1440" w:header="708" w:footer="708" w:gutter="0"/>
+      <w:pgMar w:top="1440" w:right="1440" w:bottom="1440" w:left="1440" w:header="620" w:footer="708" w:gutter="0"/>
       <w:pgNumType/>
       <w:docGrid w:linePitch="360"/>
     </w:sectPr>
@@ -1220,6 +1221,55 @@
     </w:p>
   </w:footnote>
 </w:footnotes>
+</file>
+
+<file path=word/header1.xml><?xml version="1.0" encoding="utf-8"?>
+<w:hdr xmlns:wpc="http://schemas.microsoft.com/office/word/2010/wordprocessingCanvas" xmlns:mc="http://schemas.openxmlformats.org/markup-compatibility/2006" xmlns:o="urn:schemas-microsoft-com:office:office" xmlns:r="http://schemas.openxmlformats.org/officeDocument/2006/relationships" xmlns:m="http://schemas.openxmlformats.org/officeDocument/2006/math" xmlns:v="urn:schemas-microsoft-com:vml" xmlns:wp14="http://schemas.microsoft.com/office/word/2010/wordprocessingDrawing" xmlns:wp="http://schemas.openxmlformats.org/drawingml/2006/wordprocessingDrawing" xmlns:w10="urn:schemas-microsoft-com:office:word" xmlns:w="http://schemas.openxmlformats.org/wordprocessingml/2006/main" xmlns:w14="http://schemas.microsoft.com/office/word/2010/wordml" xmlns:w15="http://schemas.microsoft.com/office/word/2012/wordml" xmlns:wpg="http://schemas.microsoft.com/office/word/2010/wordprocessingGroup" xmlns:wpi="http://schemas.microsoft.com/office/word/2010/wordprocessingInk" xmlns:wne="http://schemas.microsoft.com/office/word/2006/wordml" xmlns:wps="http://schemas.microsoft.com/office/word/2010/wordprocessingShape" xmlns:cx="http://schemas.microsoft.com/office/drawing/2014/chartex" xmlns:cx1="http://schemas.microsoft.com/office/drawing/2015/9/8/chartex" xmlns:cx2="http://schemas.microsoft.com/office/drawing/2015/10/21/chartex" xmlns:cx3="http://schemas.microsoft.com/office/drawing/2016/5/9/chartex" xmlns:cx4="http://schemas.microsoft.com/office/drawing/2016/5/10/chartex" xmlns:cx5="http://schemas.microsoft.com/office/drawing/2016/5/11/chartex" xmlns:cx6="http://schemas.microsoft.com/office/drawing/2016/5/12/chartex" xmlns:cx7="http://schemas.microsoft.com/office/drawing/2016/5/13/chartex" xmlns:cx8="http://schemas.microsoft.com/office/drawing/2016/5/14/chartex" xmlns:w16cid="http://schemas.microsoft.com/office/word/2016/wordml/cid" xmlns:w16se="http://schemas.microsoft.com/office/word/2015/wordml/symex">
+  <w:p>
+    <w:pPr>
+      <w:pBdr>
+        <w:bottom w:val="single" w:color="999999" w:sz="4" w:space="4"/>
+      </w:pBdr>
+      <w:tabs>
+        <w:tab w:val="right" w:pos="9026"/>
+      </w:tabs>
+      <w:spacing w:after="200"/>
+    </w:pPr>
+    <w:r>
+      <w:rPr>
+        <w:color w:val="555555"/>
+        <w:sz w:val="16"/>
+        <w:szCs w:val="16"/>
+      </w:rPr>
+      <w:t xml:space="preserve">Arifur Rahman  |  Bonus target: tomlc99 (TOML)</w:t>
+    </w:r>
+    <w:r>
+      <w:rPr>
+        <w:color w:val="555555"/>
+        <w:sz w:val="16"/>
+        <w:szCs w:val="16"/>
+      </w:rPr>
+      <w:t xml:space="preserve">	</w:t>
+    </w:r>
+    <w:r>
+      <w:rPr>
+        <w:color w:val="555555"/>
+        <w:sz w:val="16"/>
+        <w:szCs w:val="16"/>
+      </w:rPr>
+      <w:t xml:space="preserve">Page </w:t>
+      <w:fldChar w:fldCharType="begin"/>
+      <w:instrText xml:space="preserve">PAGE</w:instrText>
+      <w:fldChar w:fldCharType="separate"/>
+      <w:fldChar w:fldCharType="end"/>
+      <w:t xml:space="preserve"> of </w:t>
+      <w:fldChar w:fldCharType="begin"/>
+      <w:instrText xml:space="preserve">NUMPAGES</w:instrText>
+      <w:fldChar w:fldCharType="separate"/>
+      <w:fldChar w:fldCharType="end"/>
+    </w:r>
+  </w:p>
+</w:hdr>
 </file>
 
 <file path=word/numbering.xml><?xml version="1.0" encoding="utf-8"?>

</xml_diff>

<commit_message>
docs: simplify dedup over-counting paragraph in TOML report
Shorter sentences, plainer words. Also regenerated the docx, which
had gone stale after the last markdown edit and still showed the old
wording.
</commit_message>
<xml_diff>
--- a/report/report-toml-tomlc99.docx
+++ b/report/report-toml-tomlc99.docx
@@ -20,9 +20,9 @@
           <w:b/>
           <w:bCs/>
         </w:rPr>
-        <w:t xml:space="preserve">Supplementary to </w:t>
-      </w:r>
-      <w:hyperlink w:history="1" r:id="rIdizayyl7fvskwqsozdwhw3">
+        <w:t xml:space="preserve">This is a supplement to </w:t>
+      </w:r>
+      <w:hyperlink w:history="1" r:id="rIdznqdlsadnq_awwvuienfj">
         <w:r>
           <w:rPr>
             <w:rStyle w:val="Hyperlink"/>
@@ -37,10 +37,10 @@
           <w:b/>
           <w:bCs/>
         </w:rPr>
-        <w:t xml:space="preserve">, which is the primary submission.</w:t>
-      </w:r>
-      <w:r>
-        <w:t xml:space="preserve"> Same pipeline, same </w:t>
+        <w:t xml:space="preserve">, which is the primary report.</w:t>
+      </w:r>
+      <w:r>
+        <w:t xml:space="preserve"> It uses the same pipeline and the same </w:t>
       </w:r>
       <w:r>
         <w:rPr>
@@ -50,7 +50,7 @@
         <w:t xml:space="preserve">fuzzer/</w:t>
       </w:r>
       <w:r>
-        <w:t xml:space="preserve"> spine, no code changes to support this target. The design rationale (crash-vs-rejection contract, the proxy signal, survey and shrink passes, dedup mechanics) is identical to the primary report and isn't repeated here.</w:t>
+        <w:t xml:space="preserve"> code, with no changes needed to support this second target. The design details (how crashes are told apart from valid rejections, the proxy signal, the two-pass testing approach, how duplicate crashes are grouped) are the same as in the primary report and aren't repeated here.</w:t>
       </w:r>
     </w:p>
     <w:p>
@@ -67,7 +67,7 @@
       <w:r>
         <w:t xml:space="preserve"> </w:t>
       </w:r>
-      <w:hyperlink w:history="1" r:id="rIdsp2j3iggoinrdcznl9vhl">
+      <w:hyperlink w:history="1" r:id="rIdnphmrfpgu0minxoxsvk2g">
         <w:r>
           <w:rPr>
             <w:rStyle w:val="Hyperlink"/>
@@ -145,7 +145,7 @@
         <w:spacing w:after="80" w:before="160"/>
       </w:pPr>
       <w:r>
-        <w:t xml:space="preserve">Why a second target</w:t>
+        <w:t xml:space="preserve">Why I added a second target</w:t>
       </w:r>
     </w:p>
     <w:p>
@@ -153,7 +153,7 @@
         <w:spacing w:after="100" w:line="240"/>
       </w:pPr>
       <w:r>
-        <w:t xml:space="preserve">The JSON run found nothing, and a single negative result is hard to read. It could mean parson is solid, or it could mean my pipeline can't find bugs at all. Adding a second library answers two questions at once: is the spine actually target-independent, and does a less-hardened parser behave differently? Both answers came back yes. Nothing in </w:t>
+        <w:t xml:space="preserve">The JSON run found nothing, and a single negative result is hard to read on its own. It could mean parson is genuinely solid, or it could mean my pipeline just can't find bugs at all. Testing a second library answers both questions at once: does the same pipeline work without changes on a different target, and does a less-hardened parser behave differently? Both answers turned out to be yes. Nothing in </w:t>
       </w:r>
       <w:r>
         <w:rPr>
@@ -203,7 +203,7 @@
         <w:t xml:space="preserve">campaign.py</w:t>
       </w:r>
       <w:r>
-        <w:t xml:space="preserve"> changed, and TOML produced a real bug.</w:t>
+        <w:t xml:space="preserve"> needed to change, and TOML produced a real bug.</w:t>
       </w:r>
     </w:p>
     <w:p>
@@ -229,7 +229,7 @@
         <w:spacing w:after="100" w:line="240"/>
       </w:pPr>
       <w:r>
-        <w:t xml:space="preserve">Step 1 probing, before any agentic loop ran, turned up the important structural fact: </w:t>
+        <w:t xml:space="preserve">Before running the agentic loop, I tested the library by hand and found something important. </w:t>
       </w:r>
       <w:r>
         <w:rPr>
@@ -239,7 +239,7 @@
         <w:t xml:space="preserve">toml.c</w:t>
       </w:r>
       <w:r>
-        <w:t xml:space="preserve"> has no nesting-depth cap at all. parson has an explicit </w:t>
+        <w:t xml:space="preserve"> has no limit on how deeply it will nest arrays or tables. parson, by contrast, has an explicit cap (</w:t>
       </w:r>
       <w:r>
         <w:rPr>
@@ -249,7 +249,15 @@
         <w:t xml:space="preserve">MAX_NESTING 2048</w:t>
       </w:r>
       <w:r>
-        <w:t xml:space="preserve"> and refuses cleanly past it; tomlc99 just keeps recursing. A hand-built input at depth 50,000 overflows the stack, and the actual boundary sits somewhere between roughly 23,000 and 27,000 depending on the shape and on process-to-process jitter (</w:t>
+        <w:t xml:space="preserve">) and rejects anything past it cleanly. tomlc99 has no such check; it just keeps recursing until the program crashes.</w:t>
+      </w:r>
+    </w:p>
+    <w:p>
+      <w:pPr>
+        <w:spacing w:after="100" w:line="240"/>
+      </w:pPr>
+      <w:r>
+        <w:t xml:space="preserve">I built an input nested 50,000 levels deep, and it overflowed the stack. The exact point where it breaks isn't fixed. It falls somewhere between roughly 23,000 and 27,000, depending on the shape of the input and small differences between runs (</w:t>
       </w:r>
       <w:r>
         <w:rPr>
@@ -267,7 +275,7 @@
         <w:spacing w:after="100" w:line="240"/>
       </w:pPr>
       <w:r>
-        <w:t xml:space="preserve">The loop was seeded with that finding, and then independently generated inputs that reached the same crash through its own deep-nesting strategies. That matters more than finding it by hand did, because it shows the depth signal genuinely steers toward the bug rather than just describing it after the fact.</w:t>
+        <w:t xml:space="preserve">I gave the loop this finding as a starting point, and it went on to generate its own deeply nested inputs that hit the same crash on its own, using its own strategies. That's a stronger result than finding the bug by hand. It shows the depth signal actually leads the loop toward the bug, not just that the bug happened to exist.</w:t>
       </w:r>
     </w:p>
     <w:p>
@@ -284,7 +292,7 @@
         <w:spacing w:after="100" w:line="240"/>
       </w:pPr>
       <w:r>
-        <w:t xml:space="preserve">The triage pipeline reported four unique crash signatures. Reading the actual stack traces, all four are </w:t>
+        <w:t xml:space="preserve">The triage pipeline reported four separate crash signatures. But reading the actual stack traces, all four are the same thing: </w:t>
       </w:r>
       <w:r>
         <w:rPr>
@@ -294,77 +302,7 @@
         <w:t xml:space="preserve">AddressSanitizer: stack-overflow</w:t>
       </w:r>
       <w:r>
-        <w:t xml:space="preserve">, and the frame identity differs only because of what happened to be executing when the guard page got hit: a </w:t>
-      </w:r>
-      <w:r>
-        <w:rPr>
-          <w:rFonts w:ascii="Consolas" w:cs="Consolas" w:eastAsia="Consolas" w:hAnsi="Consolas"/>
-          <w:shd w:fill="F0F0F0" w:val="clear"/>
-        </w:rPr>
-        <w:t xml:space="preserve">malloc</w:t>
-      </w:r>
-      <w:r>
-        <w:t xml:space="preserve"> inside </w:t>
-      </w:r>
-      <w:r>
-        <w:rPr>
-          <w:rFonts w:ascii="Consolas" w:cs="Consolas" w:eastAsia="Consolas" w:hAnsi="Consolas"/>
-          <w:shd w:fill="F0F0F0" w:val="clear"/>
-        </w:rPr>
-        <w:t xml:space="preserve">expand</w:t>
-      </w:r>
-      <w:r>
-        <w:t xml:space="preserve">/</w:t>
-      </w:r>
-      <w:r>
-        <w:rPr>
-          <w:rFonts w:ascii="Consolas" w:cs="Consolas" w:eastAsia="Consolas" w:hAnsi="Consolas"/>
-          <w:shd w:fill="F0F0F0" w:val="clear"/>
-        </w:rPr>
-        <w:t xml:space="preserve">expand_arritem</w:t>
-      </w:r>
-      <w:r>
-        <w:t xml:space="preserve"> during array growth, a </w:t>
-      </w:r>
-      <w:r>
-        <w:rPr>
-          <w:rFonts w:ascii="Consolas" w:cs="Consolas" w:eastAsia="Consolas" w:hAnsi="Consolas"/>
-          <w:shd w:fill="F0F0F0" w:val="clear"/>
-        </w:rPr>
-        <w:t xml:space="preserve">strnlen</w:t>
-      </w:r>
-      <w:r>
-        <w:t xml:space="preserve"> inside </w:t>
-      </w:r>
-      <w:r>
-        <w:rPr>
-          <w:rFonts w:ascii="Consolas" w:cs="Consolas" w:eastAsia="Consolas" w:hAnsi="Consolas"/>
-          <w:shd w:fill="F0F0F0" w:val="clear"/>
-        </w:rPr>
-        <w:t xml:space="preserve">STRNDUP</w:t>
-      </w:r>
-      <w:r>
-        <w:t xml:space="preserve">/</w:t>
-      </w:r>
-      <w:r>
-        <w:rPr>
-          <w:rFonts w:ascii="Consolas" w:cs="Consolas" w:eastAsia="Consolas" w:hAnsi="Consolas"/>
-          <w:shd w:fill="F0F0F0" w:val="clear"/>
-        </w:rPr>
-        <w:t xml:space="preserve">normalize_key</w:t>
-      </w:r>
-      <w:r>
-        <w:t xml:space="preserve"> during key duplication, or nothing captured at all (</w:t>
-      </w:r>
-      <w:r>
-        <w:rPr>
-          <w:rFonts w:ascii="Consolas" w:cs="Consolas" w:eastAsia="Consolas" w:hAnsi="Consolas"/>
-          <w:shd w:fill="F0F0F0" w:val="clear"/>
-        </w:rPr>
-        <w:t xml:space="preserve">&lt;empty stack&gt;</w:t>
-      </w:r>
-      <w:r>
-        <w:t xml:space="preserve">, where the unwinder itself ran out of stack). Underneath all four, the real call chain is thousands of frames of the same two functions recursing without a depth check:</w:t>
+        <w:t xml:space="preserve">. They only look different because of what the program happened to be doing right when it ran out of stack space: allocating memory during array growth, duplicating a key, or in one case nothing at all, because the crash unwinder itself ran out of stack. Strip that away, and the real call chain underneath all four is thousands of frames of the same two functions calling themselves with no depth limit:</w:t>
       </w:r>
     </w:p>
     <w:p>
@@ -405,27 +343,17 @@
         <w:spacing w:after="100" w:line="240"/>
       </w:pPr>
       <w:r>
-        <w:t xml:space="preserve">This is exactly the dedup failure mode the primary report flags as untested, and now it has been tested. Top-N-frame hashing over-counts for a stack-overflow class of bug, because the crash site is decided by allocator and scheduler timing rather than by the root cause, so four samples of one overflow can legitimately hash to four different signatures. Iteration 3 caught this on its own, noting in its refinement reasoning that </w:t>
-      </w:r>
-      <w:r>
-        <w:rPr>
-          <w:i/>
-          <w:iCs/>
-        </w:rPr>
-        <w:t xml:space="preserve">"unique_crash_signatures rose from 3 to 4, and it's the same stack-overflow bug family"</w:t>
-      </w:r>
-      <w:r>
-        <w:t xml:space="preserve">, then correctly stopped spending budget re-finding it and redirected toward acceptance rate. The honest count is </w:t>
+        <w:t xml:space="preserve">The primary report admitted that my crash-grouping method had never been tested on a real crash, only a toy one. Here it finally was, and it exposed a real weakness. My method groups crashes by hashing the last few stack frames, but for a stack-overflow bug those frames depend on timing, not on what actually caused the crash, so one real bug can show up as several different-looking signatures. The loop caught this on its own in iteration 3, noting that the signature count had gone from 3 to 4 but calling it "the same stack-overflow bug family," and correctly stopped spending budget trying to re-find it. So the honest count is </w:t>
       </w:r>
       <w:r>
         <w:rPr>
           <w:b/>
           <w:bCs/>
         </w:rPr>
-        <w:t xml:space="preserve">one confirmed root cause</w:t>
-      </w:r>
-      <w:r>
-        <w:t xml:space="preserve">, unbounded parser recursion, reachable by at least two distinct code paths, reported as four raw signatures. All four reproducers were re-verified standalone against the pinned build and crash deterministically.</w:t>
+        <w:t xml:space="preserve">one confirmed bug</w:t>
+      </w:r>
+      <w:r>
+        <w:t xml:space="preserve">: unbounded recursion, reachable through at least two code paths, that showed up as four raw signatures. I re-ran all four saved crash inputs by hand against the pinned build, and each one crashes the same way every time.</w:t>
       </w:r>
     </w:p>
     <w:p>
@@ -434,7 +362,7 @@
         <w:spacing w:after="80" w:before="160"/>
       </w:pPr>
       <w:r>
-        <w:t xml:space="preserve">Large reproducers are diagnostic, not a pipeline defect</w:t>
+        <w:t xml:space="preserve">The reproducers are large, and that's expected, not a flaw</w:t>
       </w:r>
     </w:p>
     <w:p>
@@ -442,27 +370,7 @@
         <w:spacing w:after="100" w:line="240"/>
       </w:pPr>
       <w:r>
-        <w:t xml:space="preserve">Three of the four reproducers carry </w:t>
-      </w:r>
-      <w:r>
-        <w:rPr>
-          <w:rFonts w:ascii="Consolas" w:cs="Consolas" w:eastAsia="Consolas" w:hAnsi="Consolas"/>
-          <w:shd w:fill="F0F0F0" w:val="clear"/>
-        </w:rPr>
-        <w:t xml:space="preserve">minimized: NO, crash too rare to re-reach</w:t>
-      </w:r>
-      <w:r>
-        <w:t xml:space="preserve"> and run 53 to 137 KB each. That follows directly from the boundary instability above. Because the exact crashing depth shifts by roughly a thousand levels between invocations, the shrinker tries a smaller candidate, that candidate happens not to crash on that particular run, and the shrinker declines to report a reproducer it couldn't re-trigger. It keeps the original large input instead of publishing a false minimization. That's the shrinker behaving correctly against a genuinely flaky target, not a bug in </w:t>
-      </w:r>
-      <w:r>
-        <w:rPr>
-          <w:rFonts w:ascii="Consolas" w:cs="Consolas" w:eastAsia="Consolas" w:hAnsi="Consolas"/>
-          <w:shd w:fill="F0F0F0" w:val="clear"/>
-        </w:rPr>
-        <w:t xml:space="preserve">campaign.minimize</w:t>
-      </w:r>
-      <w:r>
-        <w:t xml:space="preserve">.</w:t>
+        <w:t xml:space="preserve">Three of the four saved crash inputs are marked as not fully minimized, and range from 53 to 137 KB. That follows directly from the point above: because the exact crash depth shifts by roughly a thousand levels from one run to the next, the shrinker's smaller test candidates sometimes don't crash at all. Rather than report a smaller input that might not actually reproduce the bug, the shrinker correctly keeps the original, larger one. That's the right behavior for a target whose crash point genuinely moves around, not a bug in the minimizer.</w:t>
       </w:r>
     </w:p>
     <w:p>
@@ -471,7 +379,7 @@
         <w:spacing w:after="80" w:before="160"/>
       </w:pPr>
       <w:r>
-        <w:t xml:space="preserve">How the generator evolved</w:t>
+        <w:t xml:space="preserve">How the generator changed over five rounds</w:t>
       </w:r>
     </w:p>
     <w:tbl>
@@ -489,9 +397,9 @@
       <w:tblGrid>
         <w:gridCol w:w="1386"/>
         <w:gridCol w:w="1508"/>
-        <w:gridCol w:w="946"/>
+        <w:gridCol w:w="898"/>
         <w:gridCol w:w="1142"/>
-        <w:gridCol w:w="4378"/>
+        <w:gridCol w:w="4426"/>
       </w:tblGrid>
       <w:tr>
         <w:tc>
@@ -532,7 +440,7 @@
         </w:tc>
         <w:tc>
           <w:tcPr>
-            <w:tcW w:type="dxa" w:w="946"/>
+            <w:tcW w:type="dxa" w:w="898"/>
             <w:shd w:fill="E8E8E8" w:val="clear"/>
           </w:tcPr>
           <w:p>
@@ -568,7 +476,7 @@
         </w:tc>
         <w:tc>
           <w:tcPr>
-            <w:tcW w:type="dxa" w:w="4378"/>
+            <w:tcW w:type="dxa" w:w="4426"/>
             <w:shd w:fill="E8E8E8" w:val="clear"/>
           </w:tcPr>
           <w:p>
@@ -580,7 +488,7 @@
                 <w:b/>
                 <w:bCs/>
               </w:rPr>
-              <w:t xml:space="preserve">What drove the change</w:t>
+              <w:t xml:space="preserve">What changed</w:t>
             </w:r>
           </w:p>
         </w:tc>
@@ -614,7 +522,7 @@
         </w:tc>
         <w:tc>
           <w:tcPr>
-            <w:tcW w:type="dxa" w:w="946"/>
+            <w:tcW w:type="dxa" w:w="898"/>
           </w:tcPr>
           <w:p>
             <w:pPr>
@@ -640,14 +548,14 @@
         </w:tc>
         <w:tc>
           <w:tcPr>
-            <w:tcW w:type="dxa" w:w="4378"/>
-          </w:tcPr>
-          <w:p>
-            <w:pPr>
-              <w:spacing w:after="0" w:line="240"/>
-            </w:pPr>
-            <w:r>
-              <w:t xml:space="preserve">seed from grammar + measured gaps</w:t>
+            <w:tcW w:type="dxa" w:w="4426"/>
+          </w:tcPr>
+          <w:p>
+            <w:pPr>
+              <w:spacing w:after="0" w:line="240"/>
+            </w:pPr>
+            <w:r>
+              <w:t xml:space="preserve">first version, seeded from the grammar and measured gaps</w:t>
             </w:r>
           </w:p>
         </w:tc>
@@ -681,7 +589,7 @@
         </w:tc>
         <w:tc>
           <w:tcPr>
-            <w:tcW w:type="dxa" w:w="946"/>
+            <w:tcW w:type="dxa" w:w="898"/>
           </w:tcPr>
           <w:p>
             <w:pPr>
@@ -707,14 +615,14 @@
         </w:tc>
         <w:tc>
           <w:tcPr>
-            <w:tcW w:type="dxa" w:w="4378"/>
-          </w:tcPr>
-          <w:p>
-            <w:pPr>
-              <w:spacing w:after="0" w:line="240"/>
-            </w:pPr>
-            <w:r>
-              <w:t xml:space="preserve">isolated deep nesting out of ordinary documents</w:t>
+            <w:tcW w:type="dxa" w:w="4426"/>
+          </w:tcPr>
+          <w:p>
+            <w:pPr>
+              <w:spacing w:after="0" w:line="240"/>
+            </w:pPr>
+            <w:r>
+              <w:t xml:space="preserve">moved deep nesting into its own strategy</w:t>
             </w:r>
           </w:p>
         </w:tc>
@@ -748,7 +656,7 @@
         </w:tc>
         <w:tc>
           <w:tcPr>
-            <w:tcW w:type="dxa" w:w="946"/>
+            <w:tcW w:type="dxa" w:w="898"/>
           </w:tcPr>
           <w:p>
             <w:pPr>
@@ -774,14 +682,14 @@
         </w:tc>
         <w:tc>
           <w:tcPr>
-            <w:tcW w:type="dxa" w:w="4378"/>
-          </w:tcPr>
-          <w:p>
-            <w:pPr>
-              <w:spacing w:after="0" w:line="240"/>
-            </w:pPr>
-            <w:r>
-              <w:t xml:space="preserve">found the crash family, reduced deep-stress weight</w:t>
+            <w:tcW w:type="dxa" w:w="4426"/>
+          </w:tcPr>
+          <w:p>
+            <w:pPr>
+              <w:spacing w:after="0" w:line="240"/>
+            </w:pPr>
+            <w:r>
+              <w:t xml:space="preserve">found the crash, then reduced how aggressively it nested</w:t>
             </w:r>
           </w:p>
         </w:tc>
@@ -815,7 +723,7 @@
         </w:tc>
         <w:tc>
           <w:tcPr>
-            <w:tcW w:type="dxa" w:w="946"/>
+            <w:tcW w:type="dxa" w:w="898"/>
           </w:tcPr>
           <w:p>
             <w:pPr>
@@ -841,14 +749,14 @@
         </w:tc>
         <w:tc>
           <w:tcPr>
-            <w:tcW w:type="dxa" w:w="4378"/>
-          </w:tcPr>
-          <w:p>
-            <w:pPr>
-              <w:spacing w:after="0" w:line="240"/>
-            </w:pPr>
-            <w:r>
-              <w:t xml:space="preserve">recognized one bug family, redirected to acceptance</w:t>
+            <w:tcW w:type="dxa" w:w="4426"/>
+          </w:tcPr>
+          <w:p>
+            <w:pPr>
+              <w:spacing w:after="0" w:line="240"/>
+            </w:pPr>
+            <w:r>
+              <w:t xml:space="preserve">recognized it was one bug family, shifted focus to acceptance</w:t>
             </w:r>
           </w:p>
         </w:tc>
@@ -882,7 +790,7 @@
         </w:tc>
         <w:tc>
           <w:tcPr>
-            <w:tcW w:type="dxa" w:w="946"/>
+            <w:tcW w:type="dxa" w:w="898"/>
           </w:tcPr>
           <w:p>
             <w:pPr>
@@ -908,14 +816,14 @@
         </w:tc>
         <w:tc>
           <w:tcPr>
-            <w:tcW w:type="dxa" w:w="4378"/>
-          </w:tcPr>
-          <w:p>
-            <w:pPr>
-              <w:spacing w:after="0" w:line="240"/>
-            </w:pPr>
-            <w:r>
-              <w:t xml:space="preserve">byte-level string content, acceptance recovery</w:t>
+            <w:tcW w:type="dxa" w:w="4426"/>
+          </w:tcPr>
+          <w:p>
+            <w:pPr>
+              <w:spacing w:after="0" w:line="240"/>
+            </w:pPr>
+            <w:r>
+              <w:t xml:space="preserve">worked on string content and recovering acceptance rate</w:t>
             </w:r>
           </w:p>
         </w:tc>
@@ -931,17 +839,7 @@
         <w:spacing w:after="100" w:line="240"/>
       </w:pPr>
       <w:r>
-        <w:t xml:space="preserve">Iteration 0's 6.2% acceptance is the textbook version of the failure the loop exists to catch. The generator put an uncapped-depth nested draw inside </w:t>
-      </w:r>
-      <w:r>
-        <w:rPr>
-          <w:i/>
-          <w:iCs/>
-        </w:rPr>
-        <w:t xml:space="preserve">every</w:t>
-      </w:r>
-      <w:r>
-        <w:t xml:space="preserve"> ordinary document, so roughly 40% of otherwise-valid documents got dragged down by one runaway field. This is the "correcting a generator that was mostly being rejected" case the assignment calls out, and it happened here rather than on the JSON target. Iteration 1 diagnosed it from the acceptance number alone, moved deep nesting into its own dedicated strategy instead of contaminating every document, and acceptance jumped to 43% in a single round.</w:t>
+        <w:t xml:space="preserve">Iteration 0's 6.2% acceptance rate is a textbook example of the exact failure this whole approach is meant to catch. The first generator added an unlimited nesting draw inside every single document, so roughly 40% of otherwise normal documents got dragged down and rejected because of one runaway field. This is the kind of "generator that's mostly getting rejected" case the assignment specifically asks about, and it happened here rather than on the JSON side. From the acceptance number alone, iteration 1 figured out the problem, gave deep nesting its own separate strategy instead of mixing it into every document, and acceptance jumped to 43% in one round.</w:t>
       </w:r>
     </w:p>
     <w:p>
@@ -949,7 +847,7 @@
         <w:spacing w:after="100" w:line="240"/>
       </w:pPr>
       <w:r>
-        <w:t xml:space="preserve">From there the loop behaved the way I'd hoped. Iteration 2 found the crash family and immediately reduced deep-stress weight rather than escalating it, which is the right instinct once a bug is already reproducible. Iterations 3 and 4 spent the remaining budget on acceptance rate and byte-level string content, following the target-specific note in </w:t>
+        <w:t xml:space="preserve">After that, the loop did what I'd hoped it would. Iteration 2 found the crash and immediately backed off how hard it pushed nesting, which is the right move once a bug is already reproducible. Iterations 3 and 4 spent the rest of the budget improving acceptance and testing string content at the byte level, following the note in </w:t>
       </w:r>
       <w:r>
         <w:rPr>
@@ -959,7 +857,7 @@
         <w:t xml:space="preserve">ADAPTATIONS.md</w:t>
       </w:r>
       <w:r>
-        <w:t xml:space="preserve"> that tomlc99's numeric handling is thorough and not worth the budget the JSON generator spent there.</w:t>
+        <w:t xml:space="preserve"> that tomlc99 already handles numbers carefully, so that wasn't worth spending more budget on.</w:t>
       </w:r>
     </w:p>
     <w:p>
@@ -980,10 +878,10 @@
           <w:b/>
           <w:bCs/>
         </w:rPr>
-        <w:t xml:space="preserve">A flaky crash boundary makes "found the bug" a probabilistic claim.</w:t>
-      </w:r>
-      <w:r>
-        <w:t xml:space="preserve"> parson's nesting wall was exact to the input every single time. tomlc99's crash depends on process stack layout, so "at depth X" is a fact about one run, not about the bug. The pipeline handles this correctly, verifying before reporting and declining to over-minimize, but it changes what the evidence means.</w:t>
+        <w:t xml:space="preserve">A crash point that moves makes "found the bug" a probability, not a fact.</w:t>
+      </w:r>
+      <w:r>
+        <w:t xml:space="preserve"> parson's nesting limit was exact and identical every time I tested it. tomlc99's crash depends on how the stack happens to be laid out on a given run, so saying "it crashes at depth X" is only true for that one run, not a fixed property of the bug. The pipeline handles this correctly, since it verifies before reporting and refuses to over-minimize, but it does change what the evidence actually proves.</w:t>
       </w:r>
     </w:p>
     <w:p>
@@ -995,10 +893,10 @@
           <w:b/>
           <w:bCs/>
         </w:rPr>
-        <w:t xml:space="preserve">Dedup over-splitting is now demonstrated rather than hypothetical.</w:t>
-      </w:r>
-      <w:r>
-        <w:t xml:space="preserve"> I deliberately did not implement a fix, because re-normalizing after already knowing the answer would be circular. The honest fix for a future iteration is a secondary grouping pass keyed on the sanitizer error class plus whether the top frames are dominated by a single repeated function, which would collapse all four of these into one reported bug automatically.</w:t>
+        <w:t xml:space="preserve">My crash-grouping method really does over-count, and now I have proof.</w:t>
+      </w:r>
+      <w:r>
+        <w:t xml:space="preserve"> I deliberately didn't fix this here, because adjusting the grouping logic after already knowing the answer would be circular reasoning. The honest fix for later would be a second grouping pass that also checks whether the sanitizer error type matches and whether one function dominates the stack, which would correctly merge all four signatures into one.</w:t>
       </w:r>
     </w:p>
     <w:p>
@@ -1010,20 +908,10 @@
           <w:b/>
           <w:bCs/>
         </w:rPr>
-        <w:t xml:space="preserve">Cost ran higher than JSON's</w:t>
-      </w:r>
-      <w:r>
-        <w:t xml:space="preserve">, $2.76 against $0.86, almost entirely from iteration 2's single $0.72 call. That call carried a 157K-token input, because the previous iteration's full strategy code plus several large first-seen crash inputs all went back into the feedback prompt verbatim. A future version should truncate or summarize oversized </w:t>
-      </w:r>
-      <w:r>
-        <w:rPr>
-          <w:rFonts w:ascii="Consolas" w:cs="Consolas" w:eastAsia="Consolas" w:hAnsi="Consolas"/>
-          <w:shd w:fill="F0F0F0" w:val="clear"/>
-        </w:rPr>
-        <w:t xml:space="preserve">first_input</w:t>
-      </w:r>
-      <w:r>
-        <w:t xml:space="preserve"> values before they re-enter context.</w:t>
+        <w:t xml:space="preserve">This run cost more than the JSON one</w:t>
+      </w:r>
+      <w:r>
+        <w:t xml:space="preserve">, $2.76 versus $0.86, almost entirely from one $0.72 call in iteration 2, whose 157,000-token prompt carried the previous iteration's full strategy code plus several large crash inputs. A future version should shorten those before feeding them back in.</w:t>
       </w:r>
     </w:p>
     <w:p>

</xml_diff>

<commit_message>
docs: sync TOML markdown to hand-edits, fix table header page-break
Both docx files had drifted from their markdown sources through more
rounds of manual polish (tightened phrasing, an applied paraphrase
suggestion). Synced report-toml-tomlc99.md to match.

Also found and fixed a real layout bug in both docx files: the
results table's header row wrapped 'Max depth' onto two lines, and
without cantSplit set, the row was allowed to break mid-cell right at
the page boundary, so the continuation page showed a mostly blank
header with only the wrapped word's second line visible. Added
cantSplit and tblHeader to both header rows so they move as a unit.
Verified both files still render to exactly two pages.
</commit_message>
<xml_diff>
--- a/report/report-toml-tomlc99.docx
+++ b/report/report-toml-tomlc99.docx
@@ -66,7 +66,7 @@
     </w:p>
     <w:p>
       <w:pPr>
-        <w:spacing w:after="100"/>
+        <w:spacing w:line="276" w:lineRule="auto"/>
         <w:jc w:val="both"/>
         <w:rPr>
           <w:rFonts w:ascii="Times New Roman" w:hAnsi="Times New Roman" w:cs="Times New Roman"/>
@@ -128,6 +128,17 @@
         </w:rPr>
         <w:t xml:space="preserve">. </w:t>
       </w:r>
+    </w:p>
+    <w:p>
+      <w:pPr>
+        <w:spacing w:line="276" w:lineRule="auto"/>
+        <w:jc w:val="both"/>
+        <w:rPr>
+          <w:rFonts w:ascii="Times New Roman" w:hAnsi="Times New Roman" w:cs="Times New Roman"/>
+          <w:sz w:val="20"/>
+          <w:szCs w:val="20"/>
+        </w:rPr>
+      </w:pPr>
       <w:r>
         <w:rPr>
           <w:rFonts w:ascii="Times New Roman" w:hAnsi="Times New Roman" w:cs="Times New Roman"/>
@@ -180,6 +191,17 @@
         </w:rPr>
         <w:t xml:space="preserve">. </w:t>
       </w:r>
+    </w:p>
+    <w:p>
+      <w:pPr>
+        <w:spacing w:line="276" w:lineRule="auto"/>
+        <w:jc w:val="both"/>
+        <w:rPr>
+          <w:rFonts w:ascii="Times New Roman" w:hAnsi="Times New Roman" w:cs="Times New Roman"/>
+          <w:sz w:val="20"/>
+          <w:szCs w:val="20"/>
+        </w:rPr>
+      </w:pPr>
       <w:r>
         <w:rPr>
           <w:rFonts w:ascii="Times New Roman" w:hAnsi="Times New Roman" w:cs="Times New Roman"/>
@@ -393,7 +415,7 @@
           <w:sz w:val="20"/>
           <w:szCs w:val="20"/>
         </w:rPr>
-        <w:t xml:space="preserve">Before running the agentic loop, I tested the library by hand and found something important. </w:t>
+        <w:t xml:space="preserve">Before running the agentic loop, I tested the library by hand and found </w:t>
       </w:r>
       <w:r>
         <w:rPr>
@@ -427,7 +449,23 @@
           <w:sz w:val="20"/>
           <w:szCs w:val="20"/>
         </w:rPr>
-        <w:t>) and rejects anything past it cleanly. tomlc99 has no such check; it just keeps recursing until the program crashes.</w:t>
+        <w:t>) and rejects anything past it cleanly. tomlc99 has no such check</w:t>
+      </w:r>
+      <w:r>
+        <w:rPr>
+          <w:rFonts w:ascii="Times New Roman" w:hAnsi="Times New Roman" w:cs="Times New Roman"/>
+          <w:sz w:val="20"/>
+          <w:szCs w:val="20"/>
+        </w:rPr>
+        <w:t>. It</w:t>
+      </w:r>
+      <w:r>
+        <w:rPr>
+          <w:rFonts w:ascii="Times New Roman" w:hAnsi="Times New Roman" w:cs="Times New Roman"/>
+          <w:sz w:val="20"/>
+          <w:szCs w:val="20"/>
+        </w:rPr>
+        <w:t xml:space="preserve"> just keeps recursing until the program crashes.</w:t>
       </w:r>
     </w:p>
     <w:p>
@@ -482,7 +520,23 @@
           <w:sz w:val="20"/>
           <w:szCs w:val="20"/>
         </w:rPr>
-        <w:t>I gave the loop this finding as a starting point, and it went on to generate its own deeply nested inputs that hit the same crash on its own, using its own strategies. That's a stronger result than finding the bug by hand. It shows the depth signal actually leads the loop toward the bug, not just that the bug happened to exist.</w:t>
+        <w:t xml:space="preserve">I gave the loop this finding as a starting point, and it went on to generate its own deeply nested inputs that hit the same crash on its own, using its own strategies. That's a stronger result than finding the bug by hand. It shows the depth signal </w:t>
+      </w:r>
+      <w:r>
+        <w:rPr>
+          <w:rFonts w:ascii="Times New Roman" w:hAnsi="Times New Roman" w:cs="Times New Roman"/>
+          <w:sz w:val="20"/>
+          <w:szCs w:val="20"/>
+        </w:rPr>
+        <w:t>leads</w:t>
+      </w:r>
+      <w:r>
+        <w:rPr>
+          <w:rFonts w:ascii="Times New Roman" w:hAnsi="Times New Roman" w:cs="Times New Roman"/>
+          <w:sz w:val="20"/>
+          <w:szCs w:val="20"/>
+        </w:rPr>
+        <w:t xml:space="preserve"> the loop toward the bug, not just that the bug happened to exist.</w:t>
       </w:r>
     </w:p>
     <w:p>
@@ -618,7 +672,23 @@
           <w:sz w:val="20"/>
           <w:szCs w:val="20"/>
         </w:rPr>
-        <w:t xml:space="preserve"> the crash, so one real bug can show up as several different-looking signatures. The loop caught this on its own in iteration 3, noting that the signature count had gone from 3 to 4 but calling it "the same stack-overflow bug family," and correctly stopped spending budget trying to re-find it. So the honest count is </w:t>
+        <w:t xml:space="preserve"> the crash, so one real bug can show up as several different-looking signatures. The loop caught this on its own in iteration 3, noting that the signature count had gone from 3 to 4 but calling it "the same stack-overflow bug family," and correctly stopped spending budget trying to re-find it. </w:t>
+      </w:r>
+      <w:r>
+        <w:rPr>
+          <w:rFonts w:ascii="Times New Roman" w:hAnsi="Times New Roman" w:cs="Times New Roman"/>
+          <w:sz w:val="20"/>
+          <w:szCs w:val="20"/>
+        </w:rPr>
+        <w:t>So,</w:t>
+      </w:r>
+      <w:r>
+        <w:rPr>
+          <w:rFonts w:ascii="Times New Roman" w:hAnsi="Times New Roman" w:cs="Times New Roman"/>
+          <w:sz w:val="20"/>
+          <w:szCs w:val="20"/>
+        </w:rPr>
+        <w:t xml:space="preserve"> the honest count is </w:t>
       </w:r>
       <w:r>
         <w:rPr>
@@ -671,15 +741,39 @@
           <w:sz w:val="20"/>
           <w:szCs w:val="20"/>
         </w:rPr>
-        <w:t xml:space="preserve">Three of the four saved crash inputs are marked as not fully minimized, and range from 53 to 137 KB. That follows directly from the point above: because the exact crash depth shifts by roughly a thousand levels from one run to the next, the shrinker's smaller test candidates sometimes don't crash at all. Rather than report a smaller input that might not actually reproduce the bug, the shrinker correctly keeps the original, larger one. That's the right behavior for a target whose crash point genuinely moves </w:t>
-      </w:r>
-      <w:r>
-        <w:rPr>
-          <w:rFonts w:ascii="Times New Roman" w:hAnsi="Times New Roman" w:cs="Times New Roman"/>
-          <w:sz w:val="20"/>
-          <w:szCs w:val="20"/>
-        </w:rPr>
-        <w:t>around, not a bug in the minimizer.</w:t>
+        <w:t xml:space="preserve">Three of the four saved crash inputs are not fully </w:t>
+      </w:r>
+      <w:r>
+        <w:rPr>
+          <w:rFonts w:ascii="Times New Roman" w:hAnsi="Times New Roman" w:cs="Times New Roman"/>
+          <w:sz w:val="20"/>
+          <w:szCs w:val="20"/>
+        </w:rPr>
+        <w:t>minimized and</w:t>
+      </w:r>
+      <w:r>
+        <w:rPr>
+          <w:rFonts w:ascii="Times New Roman" w:hAnsi="Times New Roman" w:cs="Times New Roman"/>
+          <w:sz w:val="20"/>
+          <w:szCs w:val="20"/>
+        </w:rPr>
+        <w:t xml:space="preserve"> range from 53 to 137 KB</w:t>
+      </w:r>
+      <w:r>
+        <w:rPr>
+          <w:rFonts w:ascii="Times New Roman" w:hAnsi="Times New Roman" w:cs="Times New Roman"/>
+          <w:sz w:val="20"/>
+          <w:szCs w:val="20"/>
+        </w:rPr>
+        <w:t>,</w:t>
+      </w:r>
+      <w:r>
+        <w:rPr>
+          <w:rFonts w:ascii="Times New Roman" w:hAnsi="Times New Roman" w:cs="Times New Roman"/>
+          <w:sz w:val="20"/>
+          <w:szCs w:val="20"/>
+        </w:rPr>
+        <w:t xml:space="preserve"> because the exact crash depth shifts by roughly a thousand levels from one run to the next, the shrinker's smaller test candidates sometimes don't crash at all. Rather than report a smaller input that might not actually reproduce the bug, the shrinker correctly keeps the original, larger one. </w:t>
       </w:r>
     </w:p>
     <w:p>
@@ -724,12 +818,10 @@
         <w:gridCol w:w="4685"/>
       </w:tblGrid>
       <w:tr>
-        <w:tblPrEx>
-          <w:tblCellMar>
-            <w:top w:w="0" w:type="dxa"/>
-            <w:bottom w:w="0" w:type="dxa"/>
-          </w:tblCellMar>
-        </w:tblPrEx>
+        <w:trPr>
+          <w:cantSplit/>
+          <w:tblHeader/>
+        </w:trPr>
         <w:tc>
           <w:tcPr>
             <w:tcW w:w="1386" w:type="dxa"/>
@@ -862,12 +954,6 @@
         </w:tc>
       </w:tr>
       <w:tr>
-        <w:tblPrEx>
-          <w:tblCellMar>
-            <w:top w:w="0" w:type="dxa"/>
-            <w:bottom w:w="0" w:type="dxa"/>
-          </w:tblCellMar>
-        </w:tblPrEx>
         <w:tc>
           <w:tcPr>
             <w:tcW w:w="1386" w:type="dxa"/>
@@ -984,12 +1070,6 @@
         </w:tc>
       </w:tr>
       <w:tr>
-        <w:tblPrEx>
-          <w:tblCellMar>
-            <w:top w:w="0" w:type="dxa"/>
-            <w:bottom w:w="0" w:type="dxa"/>
-          </w:tblCellMar>
-        </w:tblPrEx>
         <w:tc>
           <w:tcPr>
             <w:tcW w:w="1386" w:type="dxa"/>
@@ -1106,12 +1186,6 @@
         </w:tc>
       </w:tr>
       <w:tr>
-        <w:tblPrEx>
-          <w:tblCellMar>
-            <w:top w:w="0" w:type="dxa"/>
-            <w:bottom w:w="0" w:type="dxa"/>
-          </w:tblCellMar>
-        </w:tblPrEx>
         <w:tc>
           <w:tcPr>
             <w:tcW w:w="1386" w:type="dxa"/>
@@ -1228,12 +1302,6 @@
         </w:tc>
       </w:tr>
       <w:tr>
-        <w:tblPrEx>
-          <w:tblCellMar>
-            <w:top w:w="0" w:type="dxa"/>
-            <w:bottom w:w="0" w:type="dxa"/>
-          </w:tblCellMar>
-        </w:tblPrEx>
         <w:tc>
           <w:tcPr>
             <w:tcW w:w="1386" w:type="dxa"/>
@@ -1350,12 +1418,6 @@
         </w:tc>
       </w:tr>
       <w:tr>
-        <w:tblPrEx>
-          <w:tblCellMar>
-            <w:top w:w="0" w:type="dxa"/>
-            <w:bottom w:w="0" w:type="dxa"/>
-          </w:tblCellMar>
-        </w:tblPrEx>
         <w:tc>
           <w:tcPr>
             <w:tcW w:w="1386" w:type="dxa"/>
@@ -1499,15 +1561,7 @@
           <w:sz w:val="20"/>
           <w:szCs w:val="20"/>
         </w:rPr>
-        <w:t>Iteration 0's 6.2% acceptance rate is a textbook example of the exact failure this whole approach is meant to catch. The first generator added an unlimited nesting draw inside every single document, so roughly 40% of otherwise normal documents got dragged down and rejected because of one runaway field. This is the kind of "generator that's mostly getting rejected" case the assignment specifically asks about, and it happened here rather than on the JSON side. From the acceptance number alone, iteration 1 fig</w:t>
-      </w:r>
-      <w:r>
-        <w:rPr>
-          <w:rFonts w:ascii="Times New Roman" w:hAnsi="Times New Roman" w:cs="Times New Roman"/>
-          <w:sz w:val="20"/>
-          <w:szCs w:val="20"/>
-        </w:rPr>
-        <w:t>ured out the problem, gave deep nesting its own separate strategy instead of mixing it into every document, and acceptance jumped to 43% in one round.</w:t>
+        <w:t>Iteration 0's 6.2% acceptance rate is a textbook example of the exact failure this whole approach is meant to catch. The first generator added an unlimited nesting draw inside every single document, so roughly 40% of otherwise normal documents got dragged down and rejected because of one runaway field. This is the kind of "generator that's mostly getting rejected" case the assignment specifically asks about, and it happened here rather than on the JSON side. From the acceptance number alone, iteration 1 figured out the problem, gave deep nesting its own separate strategy instead of mixing it into every document, and acceptance jumped to 43% in one round.</w:t>
       </w:r>
     </w:p>
     <w:p>
@@ -1526,7 +1580,23 @@
           <w:sz w:val="20"/>
           <w:szCs w:val="20"/>
         </w:rPr>
-        <w:t xml:space="preserve">After that, the loop did what I'd hoped it would. Iteration 2 found the crash and immediately backed off how hard it pushed nesting, which is the right move once a bug is already reproducible. Iterations 3 and 4 spent the rest of the budget improving acceptance and testing string content at the byte level, following the note in </w:t>
+        <w:t xml:space="preserve">After that, the loop did what I'd hoped it would. Iteration 2 found the crash and immediately backed off how hard it pushed nesting, </w:t>
+      </w:r>
+      <w:r>
+        <w:rPr>
+          <w:rFonts w:ascii="Times New Roman" w:hAnsi="Times New Roman" w:cs="Times New Roman"/>
+          <w:sz w:val="20"/>
+          <w:szCs w:val="20"/>
+        </w:rPr>
+        <w:t>since a bug that's already reproducible doesn't need more pressure behind it</w:t>
+      </w:r>
+      <w:r>
+        <w:rPr>
+          <w:rFonts w:ascii="Times New Roman" w:hAnsi="Times New Roman" w:cs="Times New Roman"/>
+          <w:sz w:val="20"/>
+          <w:szCs w:val="20"/>
+        </w:rPr>
+        <w:t xml:space="preserve">. Iterations 3 and 4 spent the rest of the budget improving acceptance and testing string content at the byte level, following the note in </w:t>
       </w:r>
       <w:r>
         <w:rPr>
@@ -1613,7 +1683,37 @@
           <w:sz w:val="20"/>
           <w:szCs w:val="20"/>
         </w:rPr>
-        <w:t>My crash-grouping method really does over-count, and now I have proof.</w:t>
+        <w:t>The</w:t>
+      </w:r>
+      <w:r>
+        <w:rPr>
+          <w:rFonts w:ascii="Times New Roman" w:hAnsi="Times New Roman" w:cs="Times New Roman"/>
+          <w:b/>
+          <w:bCs/>
+          <w:sz w:val="20"/>
+          <w:szCs w:val="20"/>
+        </w:rPr>
+        <w:t xml:space="preserve"> crash-grouping method really does </w:t>
+      </w:r>
+      <w:r>
+        <w:rPr>
+          <w:rFonts w:ascii="Times New Roman" w:hAnsi="Times New Roman" w:cs="Times New Roman"/>
+          <w:b/>
+          <w:bCs/>
+          <w:sz w:val="20"/>
+          <w:szCs w:val="20"/>
+        </w:rPr>
+        <w:t>overcount</w:t>
+      </w:r>
+      <w:r>
+        <w:rPr>
+          <w:rFonts w:ascii="Times New Roman" w:hAnsi="Times New Roman" w:cs="Times New Roman"/>
+          <w:b/>
+          <w:bCs/>
+          <w:sz w:val="20"/>
+          <w:szCs w:val="20"/>
+        </w:rPr>
+        <w:t>.</w:t>
       </w:r>
       <w:r>
         <w:rPr>
@@ -2552,7 +2652,6 @@
   <w:style w:type="character" w:default="1" w:styleId="DefaultParagraphFont">
     <w:name w:val="Default Paragraph Font"/>
     <w:uiPriority w:val="1"/>
-    <w:semiHidden/>
     <w:unhideWhenUsed/>
   </w:style>
   <w:style w:type="table" w:default="1" w:styleId="TableNormal">

</xml_diff>

<commit_message>
docs: sync report-toml-tomlc99.docx (was locked in Word last commit)
Content matches what was already folded into report-toml-tomlc99.md;
this just gets the actual docx file into git now that Word released
the lock. Verified paragraph-by-paragraph against the .md, no
substantive diff.
</commit_message>
<xml_diff>
--- a/report/report-toml-tomlc99.docx
+++ b/report/report-toml-tomlc99.docx
@@ -24,8 +24,8 @@
         <w:jc w:val="both"/>
         <w:rPr>
           <w:rFonts w:ascii="Times New Roman" w:hAnsi="Times New Roman" w:cs="Times New Roman"/>
-          <w:sz w:val="20"/>
-          <w:szCs w:val="20"/>
+          <w:sz w:val="22"/>
+          <w:szCs w:val="22"/>
         </w:rPr>
       </w:pPr>
       <w:r>
@@ -33,24 +33,24 @@
           <w:rFonts w:ascii="Times New Roman" w:hAnsi="Times New Roman" w:cs="Times New Roman"/>
           <w:b/>
           <w:bCs/>
-          <w:sz w:val="20"/>
-          <w:szCs w:val="20"/>
+          <w:sz w:val="22"/>
+          <w:szCs w:val="22"/>
         </w:rPr>
         <w:t>This is the secondary report.</w:t>
       </w:r>
       <w:r>
         <w:rPr>
           <w:rFonts w:ascii="Times New Roman" w:hAnsi="Times New Roman" w:cs="Times New Roman"/>
-          <w:sz w:val="20"/>
-          <w:szCs w:val="20"/>
+          <w:sz w:val="22"/>
+          <w:szCs w:val="22"/>
         </w:rPr>
         <w:t xml:space="preserve"> I tested a second target, TOML, using the same pipeline and the same </w:t>
       </w:r>
       <w:r>
         <w:rPr>
           <w:rFonts w:ascii="Times New Roman" w:eastAsia="Consolas" w:hAnsi="Times New Roman" w:cs="Times New Roman"/>
-          <w:sz w:val="20"/>
-          <w:szCs w:val="20"/>
+          <w:sz w:val="22"/>
+          <w:szCs w:val="22"/>
           <w:shd w:val="clear" w:color="auto" w:fill="F0F0F0"/>
         </w:rPr>
         <w:t>fuzzer/</w:t>
@@ -58,8 +58,8 @@
       <w:r>
         <w:rPr>
           <w:rFonts w:ascii="Times New Roman" w:hAnsi="Times New Roman" w:cs="Times New Roman"/>
-          <w:sz w:val="20"/>
-          <w:szCs w:val="20"/>
+          <w:sz w:val="22"/>
+          <w:szCs w:val="22"/>
         </w:rPr>
         <w:t xml:space="preserve"> code, with no changes needed to support it. The design details (how crashes are told apart from valid rejections, the proxy signal, the two-pass testing approach, how duplicate crashes are grouped) are the same as in the primary report and aren't repeated here.</w:t>
       </w:r>
@@ -70,8 +70,8 @@
         <w:jc w:val="both"/>
         <w:rPr>
           <w:rFonts w:ascii="Times New Roman" w:hAnsi="Times New Roman" w:cs="Times New Roman"/>
-          <w:sz w:val="20"/>
-          <w:szCs w:val="20"/>
+          <w:sz w:val="22"/>
+          <w:szCs w:val="22"/>
         </w:rPr>
       </w:pPr>
       <w:r>
@@ -79,16 +79,17 @@
           <w:rFonts w:ascii="Times New Roman" w:hAnsi="Times New Roman" w:cs="Times New Roman"/>
           <w:b/>
           <w:bCs/>
-          <w:sz w:val="20"/>
-          <w:szCs w:val="20"/>
+          <w:sz w:val="22"/>
+          <w:szCs w:val="22"/>
         </w:rPr>
         <w:t>Target:</w:t>
       </w:r>
       <w:r>
         <w:rPr>
           <w:rFonts w:ascii="Times New Roman" w:hAnsi="Times New Roman" w:cs="Times New Roman"/>
-          <w:sz w:val="20"/>
-          <w:szCs w:val="20"/>
+          <w:color w:val="0070C0"/>
+          <w:sz w:val="22"/>
+          <w:szCs w:val="22"/>
         </w:rPr>
         <w:t xml:space="preserve"> </w:t>
       </w:r>
@@ -97,8 +98,9 @@
           <w:rPr>
             <w:rStyle w:val="Hyperlink"/>
             <w:rFonts w:ascii="Times New Roman" w:hAnsi="Times New Roman" w:cs="Times New Roman"/>
-            <w:sz w:val="20"/>
-            <w:szCs w:val="20"/>
+            <w:color w:val="0070C0"/>
+            <w:sz w:val="22"/>
+            <w:szCs w:val="22"/>
           </w:rPr>
           <w:t>tomlc99</w:t>
         </w:r>
@@ -106,16 +108,16 @@
       <w:r>
         <w:rPr>
           <w:rFonts w:ascii="Times New Roman" w:hAnsi="Times New Roman" w:cs="Times New Roman"/>
-          <w:sz w:val="20"/>
-          <w:szCs w:val="20"/>
+          <w:sz w:val="22"/>
+          <w:szCs w:val="22"/>
         </w:rPr>
         <w:t xml:space="preserve"> @ </w:t>
       </w:r>
       <w:r>
         <w:rPr>
           <w:rFonts w:ascii="Times New Roman" w:eastAsia="Consolas" w:hAnsi="Times New Roman" w:cs="Times New Roman"/>
-          <w:sz w:val="20"/>
-          <w:szCs w:val="20"/>
+          <w:sz w:val="22"/>
+          <w:szCs w:val="22"/>
           <w:shd w:val="clear" w:color="auto" w:fill="F0F0F0"/>
         </w:rPr>
         <w:t>29076df</w:t>
@@ -123,8 +125,8 @@
       <w:r>
         <w:rPr>
           <w:rFonts w:ascii="Times New Roman" w:hAnsi="Times New Roman" w:cs="Times New Roman"/>
-          <w:sz w:val="20"/>
-          <w:szCs w:val="20"/>
+          <w:sz w:val="22"/>
+          <w:szCs w:val="22"/>
         </w:rPr>
         <w:t xml:space="preserve">. </w:t>
       </w:r>
@@ -135,8 +137,8 @@
         <w:jc w:val="both"/>
         <w:rPr>
           <w:rFonts w:ascii="Times New Roman" w:hAnsi="Times New Roman" w:cs="Times New Roman"/>
-          <w:sz w:val="20"/>
-          <w:szCs w:val="20"/>
+          <w:sz w:val="22"/>
+          <w:szCs w:val="22"/>
         </w:rPr>
       </w:pPr>
       <w:r>
@@ -144,41 +146,77 @@
           <w:rFonts w:ascii="Times New Roman" w:hAnsi="Times New Roman" w:cs="Times New Roman"/>
           <w:b/>
           <w:bCs/>
-          <w:sz w:val="20"/>
-          <w:szCs w:val="20"/>
+          <w:sz w:val="22"/>
+          <w:szCs w:val="22"/>
         </w:rPr>
         <w:t>Grammar:</w:t>
       </w:r>
       <w:r>
         <w:rPr>
           <w:rFonts w:ascii="Times New Roman" w:hAnsi="Times New Roman" w:cs="Times New Roman"/>
-          <w:sz w:val="20"/>
-          <w:szCs w:val="20"/>
+          <w:sz w:val="22"/>
+          <w:szCs w:val="22"/>
         </w:rPr>
         <w:t xml:space="preserve"> grammars-v4 </w:t>
       </w:r>
       <w:r>
         <w:rPr>
           <w:rFonts w:ascii="Times New Roman" w:eastAsia="Consolas" w:hAnsi="Times New Roman" w:cs="Times New Roman"/>
-          <w:sz w:val="20"/>
-          <w:szCs w:val="20"/>
+          <w:sz w:val="22"/>
+          <w:szCs w:val="22"/>
           <w:shd w:val="clear" w:color="auto" w:fill="F0F0F0"/>
         </w:rPr>
-        <w:t>toml/{TomlParser,TomlLexer}.g4</w:t>
-      </w:r>
-      <w:r>
-        <w:rPr>
-          <w:rFonts w:ascii="Times New Roman" w:hAnsi="Times New Roman" w:cs="Times New Roman"/>
-          <w:sz w:val="20"/>
-          <w:szCs w:val="20"/>
+        <w:t>t</w:t>
+      </w:r>
+      <w:r>
+        <w:rPr>
+          <w:rFonts w:ascii="Times New Roman" w:eastAsia="Consolas" w:hAnsi="Times New Roman" w:cs="Times New Roman"/>
+          <w:sz w:val="22"/>
+          <w:szCs w:val="22"/>
+          <w:shd w:val="clear" w:color="auto" w:fill="F0F0F0"/>
+        </w:rPr>
+        <w:t>oml/</w:t>
+      </w:r>
+      <w:r>
+        <w:rPr>
+          <w:rFonts w:ascii="Times New Roman" w:eastAsia="Consolas" w:hAnsi="Times New Roman" w:cs="Times New Roman"/>
+          <w:sz w:val="22"/>
+          <w:szCs w:val="22"/>
+          <w:shd w:val="clear" w:color="auto" w:fill="F0F0F0"/>
+        </w:rPr>
+        <w:t>{</w:t>
+      </w:r>
+      <w:r>
+        <w:rPr>
+          <w:rFonts w:ascii="Times New Roman" w:eastAsia="Consolas" w:hAnsi="Times New Roman" w:cs="Times New Roman"/>
+          <w:sz w:val="22"/>
+          <w:szCs w:val="22"/>
+          <w:shd w:val="clear" w:color="auto" w:fill="F0F0F0"/>
+        </w:rPr>
+        <w:t>TomlParser, TomlLexer</w:t>
+      </w:r>
+      <w:r>
+        <w:rPr>
+          <w:rFonts w:ascii="Times New Roman" w:eastAsia="Consolas" w:hAnsi="Times New Roman" w:cs="Times New Roman"/>
+          <w:sz w:val="22"/>
+          <w:szCs w:val="22"/>
+          <w:shd w:val="clear" w:color="auto" w:fill="F0F0F0"/>
+        </w:rPr>
+        <w:t>}.g4</w:t>
+      </w:r>
+      <w:r>
+        <w:rPr>
+          <w:rFonts w:ascii="Times New Roman" w:hAnsi="Times New Roman" w:cs="Times New Roman"/>
+          <w:sz w:val="22"/>
+          <w:szCs w:val="22"/>
         </w:rPr>
         <w:t xml:space="preserve"> @ </w:t>
       </w:r>
       <w:r>
         <w:rPr>
           <w:rFonts w:ascii="Times New Roman" w:eastAsia="Consolas" w:hAnsi="Times New Roman" w:cs="Times New Roman"/>
-          <w:sz w:val="20"/>
-          <w:szCs w:val="20"/>
+          <w:sz w:val="22"/>
+          <w:szCs w:val="22"/>
           <w:shd w:val="clear" w:color="auto" w:fill="F0F0F0"/>
         </w:rPr>
         <w:t>e1c222f</w:t>
@@ -186,8 +224,8 @@
       <w:r>
         <w:rPr>
           <w:rFonts w:ascii="Times New Roman" w:hAnsi="Times New Roman" w:cs="Times New Roman"/>
-          <w:sz w:val="20"/>
-          <w:szCs w:val="20"/>
+          <w:sz w:val="22"/>
+          <w:szCs w:val="22"/>
         </w:rPr>
         <w:t xml:space="preserve">. </w:t>
       </w:r>
@@ -198,8 +236,8 @@
         <w:jc w:val="both"/>
         <w:rPr>
           <w:rFonts w:ascii="Times New Roman" w:hAnsi="Times New Roman" w:cs="Times New Roman"/>
-          <w:sz w:val="20"/>
-          <w:szCs w:val="20"/>
+          <w:sz w:val="22"/>
+          <w:szCs w:val="22"/>
         </w:rPr>
       </w:pPr>
       <w:r>
@@ -207,16 +245,16 @@
           <w:rFonts w:ascii="Times New Roman" w:hAnsi="Times New Roman" w:cs="Times New Roman"/>
           <w:b/>
           <w:bCs/>
-          <w:sz w:val="20"/>
-          <w:szCs w:val="20"/>
+          <w:sz w:val="22"/>
+          <w:szCs w:val="22"/>
         </w:rPr>
         <w:t>Result:</w:t>
       </w:r>
       <w:r>
         <w:rPr>
           <w:rFonts w:ascii="Times New Roman" w:hAnsi="Times New Roman" w:cs="Times New Roman"/>
-          <w:sz w:val="20"/>
-          <w:szCs w:val="20"/>
+          <w:sz w:val="22"/>
+          <w:szCs w:val="22"/>
         </w:rPr>
         <w:t xml:space="preserve"> 5 iterations, 2,500 inputs, </w:t>
       </w:r>
@@ -225,16 +263,16 @@
           <w:rFonts w:ascii="Times New Roman" w:hAnsi="Times New Roman" w:cs="Times New Roman"/>
           <w:b/>
           <w:bCs/>
-          <w:sz w:val="20"/>
-          <w:szCs w:val="20"/>
+          <w:sz w:val="22"/>
+          <w:szCs w:val="22"/>
         </w:rPr>
         <w:t>4 crash signatures, 1 confirmed root cause</w:t>
       </w:r>
       <w:r>
         <w:rPr>
           <w:rFonts w:ascii="Times New Roman" w:hAnsi="Times New Roman" w:cs="Times New Roman"/>
-          <w:sz w:val="20"/>
-          <w:szCs w:val="20"/>
+          <w:sz w:val="22"/>
+          <w:szCs w:val="22"/>
         </w:rPr>
         <w:t>, $2.76 of a $5 budget.</w:t>
       </w:r>
@@ -246,15 +284,15 @@
         <w:jc w:val="both"/>
         <w:rPr>
           <w:rFonts w:ascii="Times New Roman" w:hAnsi="Times New Roman" w:cs="Times New Roman"/>
-          <w:sz w:val="24"/>
-          <w:szCs w:val="24"/>
-        </w:rPr>
-      </w:pPr>
-      <w:r>
-        <w:rPr>
-          <w:rFonts w:ascii="Times New Roman" w:hAnsi="Times New Roman" w:cs="Times New Roman"/>
-          <w:sz w:val="24"/>
-          <w:szCs w:val="24"/>
+          <w:sz w:val="22"/>
+          <w:szCs w:val="22"/>
+        </w:rPr>
+      </w:pPr>
+      <w:r>
+        <w:rPr>
+          <w:rFonts w:ascii="Times New Roman" w:hAnsi="Times New Roman" w:cs="Times New Roman"/>
+          <w:sz w:val="22"/>
+          <w:szCs w:val="22"/>
         </w:rPr>
         <w:t>Why I added a second target</w:t>
       </w:r>
@@ -265,23 +303,39 @@
         <w:jc w:val="both"/>
         <w:rPr>
           <w:rFonts w:ascii="Times New Roman" w:hAnsi="Times New Roman" w:cs="Times New Roman"/>
-          <w:sz w:val="20"/>
-          <w:szCs w:val="20"/>
-        </w:rPr>
-      </w:pPr>
-      <w:r>
-        <w:rPr>
-          <w:rFonts w:ascii="Times New Roman" w:hAnsi="Times New Roman" w:cs="Times New Roman"/>
-          <w:sz w:val="20"/>
-          <w:szCs w:val="20"/>
-        </w:rPr>
-        <w:t xml:space="preserve">The JSON run found nothing, and a single negative result is hard to read on its own. It could mean parson is genuinely solid, or it could mean my pipeline just can't find bugs at all. Testing a second library answers both questions at once: does the same pipeline work without changes on a different target, and does a less-hardened parser behave differently? Both answers turned out to be yes. Nothing in </w:t>
+          <w:sz w:val="22"/>
+          <w:szCs w:val="22"/>
+        </w:rPr>
+      </w:pPr>
+      <w:r>
+        <w:rPr>
+          <w:rFonts w:ascii="Times New Roman" w:hAnsi="Times New Roman" w:cs="Times New Roman"/>
+          <w:sz w:val="22"/>
+          <w:szCs w:val="22"/>
+        </w:rPr>
+        <w:t xml:space="preserve">The JSON run found nothing, and a single negative result is hard to read on its own. It could mean parson is genuinely solid, or it could mean my pipeline just can't find bugs at all. Testing a second library answers </w:t>
+      </w:r>
+      <w:r>
+        <w:rPr>
+          <w:rFonts w:ascii="Times New Roman" w:hAnsi="Times New Roman" w:cs="Times New Roman"/>
+          <w:sz w:val="22"/>
+          <w:szCs w:val="22"/>
+        </w:rPr>
+        <w:t>these two</w:t>
+      </w:r>
+      <w:r>
+        <w:rPr>
+          <w:rFonts w:ascii="Times New Roman" w:hAnsi="Times New Roman" w:cs="Times New Roman"/>
+          <w:sz w:val="22"/>
+          <w:szCs w:val="22"/>
+        </w:rPr>
+        <w:t xml:space="preserve"> questions at once: does the same pipeline work without changes on a different target, and does a less-hardened parser behave differently? Both answers turned out to be yes. Nothing in </w:t>
       </w:r>
       <w:r>
         <w:rPr>
           <w:rFonts w:ascii="Times New Roman" w:eastAsia="Consolas" w:hAnsi="Times New Roman" w:cs="Times New Roman"/>
-          <w:sz w:val="20"/>
-          <w:szCs w:val="20"/>
+          <w:sz w:val="22"/>
+          <w:szCs w:val="22"/>
           <w:shd w:val="clear" w:color="auto" w:fill="F0F0F0"/>
         </w:rPr>
         <w:t>outcomes.py</w:t>
@@ -289,16 +343,16 @@
       <w:r>
         <w:rPr>
           <w:rFonts w:ascii="Times New Roman" w:hAnsi="Times New Roman" w:cs="Times New Roman"/>
-          <w:sz w:val="20"/>
-          <w:szCs w:val="20"/>
+          <w:sz w:val="22"/>
+          <w:szCs w:val="22"/>
         </w:rPr>
         <w:t xml:space="preserve">, </w:t>
       </w:r>
       <w:r>
         <w:rPr>
           <w:rFonts w:ascii="Times New Roman" w:eastAsia="Consolas" w:hAnsi="Times New Roman" w:cs="Times New Roman"/>
-          <w:sz w:val="20"/>
-          <w:szCs w:val="20"/>
+          <w:sz w:val="22"/>
+          <w:szCs w:val="22"/>
           <w:shd w:val="clear" w:color="auto" w:fill="F0F0F0"/>
         </w:rPr>
         <w:t>runner.py</w:t>
@@ -306,16 +360,16 @@
       <w:r>
         <w:rPr>
           <w:rFonts w:ascii="Times New Roman" w:hAnsi="Times New Roman" w:cs="Times New Roman"/>
-          <w:sz w:val="20"/>
-          <w:szCs w:val="20"/>
+          <w:sz w:val="22"/>
+          <w:szCs w:val="22"/>
         </w:rPr>
         <w:t xml:space="preserve">, </w:t>
       </w:r>
       <w:r>
         <w:rPr>
           <w:rFonts w:ascii="Times New Roman" w:eastAsia="Consolas" w:hAnsi="Times New Roman" w:cs="Times New Roman"/>
-          <w:sz w:val="20"/>
-          <w:szCs w:val="20"/>
+          <w:sz w:val="22"/>
+          <w:szCs w:val="22"/>
           <w:shd w:val="clear" w:color="auto" w:fill="F0F0F0"/>
         </w:rPr>
         <w:t>triage.py</w:t>
@@ -323,16 +377,16 @@
       <w:r>
         <w:rPr>
           <w:rFonts w:ascii="Times New Roman" w:hAnsi="Times New Roman" w:cs="Times New Roman"/>
-          <w:sz w:val="20"/>
-          <w:szCs w:val="20"/>
+          <w:sz w:val="22"/>
+          <w:szCs w:val="22"/>
         </w:rPr>
         <w:t xml:space="preserve">, </w:t>
       </w:r>
       <w:r>
         <w:rPr>
           <w:rFonts w:ascii="Times New Roman" w:eastAsia="Consolas" w:hAnsi="Times New Roman" w:cs="Times New Roman"/>
-          <w:sz w:val="20"/>
-          <w:szCs w:val="20"/>
+          <w:sz w:val="22"/>
+          <w:szCs w:val="22"/>
           <w:shd w:val="clear" w:color="auto" w:fill="F0F0F0"/>
         </w:rPr>
         <w:t>coverage.py</w:t>
@@ -340,16 +394,16 @@
       <w:r>
         <w:rPr>
           <w:rFonts w:ascii="Times New Roman" w:hAnsi="Times New Roman" w:cs="Times New Roman"/>
-          <w:sz w:val="20"/>
-          <w:szCs w:val="20"/>
+          <w:sz w:val="22"/>
+          <w:szCs w:val="22"/>
         </w:rPr>
         <w:t xml:space="preserve">, or </w:t>
       </w:r>
       <w:r>
         <w:rPr>
           <w:rFonts w:ascii="Times New Roman" w:eastAsia="Consolas" w:hAnsi="Times New Roman" w:cs="Times New Roman"/>
-          <w:sz w:val="20"/>
-          <w:szCs w:val="20"/>
+          <w:sz w:val="22"/>
+          <w:szCs w:val="22"/>
           <w:shd w:val="clear" w:color="auto" w:fill="F0F0F0"/>
         </w:rPr>
         <w:t>campaign.py</w:t>
@@ -357,8 +411,8 @@
       <w:r>
         <w:rPr>
           <w:rFonts w:ascii="Times New Roman" w:hAnsi="Times New Roman" w:cs="Times New Roman"/>
-          <w:sz w:val="20"/>
-          <w:szCs w:val="20"/>
+          <w:sz w:val="22"/>
+          <w:szCs w:val="22"/>
         </w:rPr>
         <w:t xml:space="preserve"> needed to change, and TOML produced a real bug.</w:t>
       </w:r>
@@ -370,15 +424,15 @@
         <w:jc w:val="both"/>
         <w:rPr>
           <w:rFonts w:ascii="Times New Roman" w:hAnsi="Times New Roman" w:cs="Times New Roman"/>
-          <w:sz w:val="24"/>
-          <w:szCs w:val="24"/>
-        </w:rPr>
-      </w:pPr>
-      <w:r>
-        <w:rPr>
-          <w:rFonts w:ascii="Times New Roman" w:hAnsi="Times New Roman" w:cs="Times New Roman"/>
-          <w:sz w:val="24"/>
-          <w:szCs w:val="24"/>
+          <w:sz w:val="22"/>
+          <w:szCs w:val="22"/>
+        </w:rPr>
+      </w:pPr>
+      <w:r>
+        <w:rPr>
+          <w:rFonts w:ascii="Times New Roman" w:hAnsi="Times New Roman" w:cs="Times New Roman"/>
+          <w:sz w:val="22"/>
+          <w:szCs w:val="22"/>
         </w:rPr>
         <w:t>Findings</w:t>
       </w:r>
@@ -390,11 +444,15 @@
         <w:jc w:val="both"/>
         <w:rPr>
           <w:rFonts w:ascii="Times New Roman" w:hAnsi="Times New Roman" w:cs="Times New Roman"/>
-        </w:rPr>
-      </w:pPr>
-      <w:r>
-        <w:rPr>
-          <w:rFonts w:ascii="Times New Roman" w:hAnsi="Times New Roman" w:cs="Times New Roman"/>
+          <w:sz w:val="22"/>
+          <w:szCs w:val="22"/>
+        </w:rPr>
+      </w:pPr>
+      <w:r>
+        <w:rPr>
+          <w:rFonts w:ascii="Times New Roman" w:hAnsi="Times New Roman" w:cs="Times New Roman"/>
+          <w:sz w:val="22"/>
+          <w:szCs w:val="22"/>
         </w:rPr>
         <w:t>A real bug, found twice</w:t>
       </w:r>
@@ -405,23 +463,23 @@
         <w:jc w:val="both"/>
         <w:rPr>
           <w:rFonts w:ascii="Times New Roman" w:hAnsi="Times New Roman" w:cs="Times New Roman"/>
-          <w:sz w:val="20"/>
-          <w:szCs w:val="20"/>
-        </w:rPr>
-      </w:pPr>
-      <w:r>
-        <w:rPr>
-          <w:rFonts w:ascii="Times New Roman" w:hAnsi="Times New Roman" w:cs="Times New Roman"/>
-          <w:sz w:val="20"/>
-          <w:szCs w:val="20"/>
+          <w:sz w:val="22"/>
+          <w:szCs w:val="22"/>
+        </w:rPr>
+      </w:pPr>
+      <w:r>
+        <w:rPr>
+          <w:rFonts w:ascii="Times New Roman" w:hAnsi="Times New Roman" w:cs="Times New Roman"/>
+          <w:sz w:val="22"/>
+          <w:szCs w:val="22"/>
         </w:rPr>
         <w:t xml:space="preserve">Before running the agentic loop, I tested the library by hand and found </w:t>
       </w:r>
       <w:r>
         <w:rPr>
           <w:rFonts w:ascii="Times New Roman" w:eastAsia="Consolas" w:hAnsi="Times New Roman" w:cs="Times New Roman"/>
-          <w:sz w:val="20"/>
-          <w:szCs w:val="20"/>
+          <w:sz w:val="22"/>
+          <w:szCs w:val="22"/>
           <w:shd w:val="clear" w:color="auto" w:fill="F0F0F0"/>
         </w:rPr>
         <w:t>toml.c</w:t>
@@ -429,16 +487,16 @@
       <w:r>
         <w:rPr>
           <w:rFonts w:ascii="Times New Roman" w:hAnsi="Times New Roman" w:cs="Times New Roman"/>
-          <w:sz w:val="20"/>
-          <w:szCs w:val="20"/>
+          <w:sz w:val="22"/>
+          <w:szCs w:val="22"/>
         </w:rPr>
         <w:t xml:space="preserve"> has no limit on how deeply it will nest arrays or tables. parson, by contrast, has an explicit cap (</w:t>
       </w:r>
       <w:r>
         <w:rPr>
           <w:rFonts w:ascii="Times New Roman" w:eastAsia="Consolas" w:hAnsi="Times New Roman" w:cs="Times New Roman"/>
-          <w:sz w:val="20"/>
-          <w:szCs w:val="20"/>
+          <w:sz w:val="22"/>
+          <w:szCs w:val="22"/>
           <w:shd w:val="clear" w:color="auto" w:fill="F0F0F0"/>
         </w:rPr>
         <w:t>MAX_NESTING 2048</w:t>
@@ -446,24 +504,24 @@
       <w:r>
         <w:rPr>
           <w:rFonts w:ascii="Times New Roman" w:hAnsi="Times New Roman" w:cs="Times New Roman"/>
-          <w:sz w:val="20"/>
-          <w:szCs w:val="20"/>
+          <w:sz w:val="22"/>
+          <w:szCs w:val="22"/>
         </w:rPr>
         <w:t>) and rejects anything past it cleanly. tomlc99 has no such check</w:t>
       </w:r>
       <w:r>
         <w:rPr>
           <w:rFonts w:ascii="Times New Roman" w:hAnsi="Times New Roman" w:cs="Times New Roman"/>
-          <w:sz w:val="20"/>
-          <w:szCs w:val="20"/>
+          <w:sz w:val="22"/>
+          <w:szCs w:val="22"/>
         </w:rPr>
         <w:t>. It</w:t>
       </w:r>
       <w:r>
         <w:rPr>
           <w:rFonts w:ascii="Times New Roman" w:hAnsi="Times New Roman" w:cs="Times New Roman"/>
-          <w:sz w:val="20"/>
-          <w:szCs w:val="20"/>
+          <w:sz w:val="22"/>
+          <w:szCs w:val="22"/>
         </w:rPr>
         <w:t xml:space="preserve"> just keeps recursing until the program crashes.</w:t>
       </w:r>
@@ -474,23 +532,23 @@
         <w:jc w:val="both"/>
         <w:rPr>
           <w:rFonts w:ascii="Times New Roman" w:hAnsi="Times New Roman" w:cs="Times New Roman"/>
-          <w:sz w:val="20"/>
-          <w:szCs w:val="20"/>
-        </w:rPr>
-      </w:pPr>
-      <w:r>
-        <w:rPr>
-          <w:rFonts w:ascii="Times New Roman" w:hAnsi="Times New Roman" w:cs="Times New Roman"/>
-          <w:sz w:val="20"/>
-          <w:szCs w:val="20"/>
+          <w:sz w:val="22"/>
+          <w:szCs w:val="22"/>
+        </w:rPr>
+      </w:pPr>
+      <w:r>
+        <w:rPr>
+          <w:rFonts w:ascii="Times New Roman" w:hAnsi="Times New Roman" w:cs="Times New Roman"/>
+          <w:sz w:val="22"/>
+          <w:szCs w:val="22"/>
         </w:rPr>
         <w:t>I built an input nested 50,000 levels deep, and it overflowed the stack. The exact point where it breaks isn't fixed. It falls somewhere between roughly 23,000 and 27,000, depending on the shape of the input and small differences between runs (</w:t>
       </w:r>
       <w:r>
         <w:rPr>
           <w:rFonts w:ascii="Times New Roman" w:eastAsia="Consolas" w:hAnsi="Times New Roman" w:cs="Times New Roman"/>
-          <w:sz w:val="20"/>
-          <w:szCs w:val="20"/>
+          <w:sz w:val="22"/>
+          <w:szCs w:val="22"/>
           <w:shd w:val="clear" w:color="auto" w:fill="F0F0F0"/>
         </w:rPr>
         <w:t>grammar/toml-tomlc99/ADAPTATIONS.md</w:t>
@@ -498,8 +556,8 @@
       <w:r>
         <w:rPr>
           <w:rFonts w:ascii="Times New Roman" w:hAnsi="Times New Roman" w:cs="Times New Roman"/>
-          <w:sz w:val="20"/>
-          <w:szCs w:val="20"/>
+          <w:sz w:val="22"/>
+          <w:szCs w:val="22"/>
         </w:rPr>
         <w:t>).</w:t>
       </w:r>
@@ -510,33 +568,41 @@
         <w:jc w:val="both"/>
         <w:rPr>
           <w:rFonts w:ascii="Times New Roman" w:hAnsi="Times New Roman" w:cs="Times New Roman"/>
-          <w:sz w:val="20"/>
-          <w:szCs w:val="20"/>
-        </w:rPr>
-      </w:pPr>
-      <w:r>
-        <w:rPr>
-          <w:rFonts w:ascii="Times New Roman" w:hAnsi="Times New Roman" w:cs="Times New Roman"/>
-          <w:sz w:val="20"/>
-          <w:szCs w:val="20"/>
-        </w:rPr>
-        <w:t xml:space="preserve">I gave the loop this finding as a starting point, and it went on to generate its own deeply nested inputs that hit the same crash on its own, using its own strategies. That's a stronger result than finding the bug by hand. It shows the depth signal </w:t>
-      </w:r>
-      <w:r>
-        <w:rPr>
-          <w:rFonts w:ascii="Times New Roman" w:hAnsi="Times New Roman" w:cs="Times New Roman"/>
-          <w:sz w:val="20"/>
-          <w:szCs w:val="20"/>
-        </w:rPr>
-        <w:t>leads</w:t>
-      </w:r>
-      <w:r>
-        <w:rPr>
-          <w:rFonts w:ascii="Times New Roman" w:hAnsi="Times New Roman" w:cs="Times New Roman"/>
-          <w:sz w:val="20"/>
-          <w:szCs w:val="20"/>
-        </w:rPr>
-        <w:t xml:space="preserve"> the loop toward the bug, not just that the bug happened to exist.</w:t>
+          <w:sz w:val="22"/>
+          <w:szCs w:val="22"/>
+        </w:rPr>
+      </w:pPr>
+      <w:r>
+        <w:rPr>
+          <w:rFonts w:ascii="Times New Roman" w:hAnsi="Times New Roman" w:cs="Times New Roman"/>
+          <w:sz w:val="22"/>
+          <w:szCs w:val="22"/>
+        </w:rPr>
+        <w:t xml:space="preserve">I gave the loop this finding as a starting point, and it went on to generate its own deeply nested inputs that hit the same crash on its own, using its own strategies. </w:t>
+      </w:r>
+      <w:r>
+        <w:rPr>
+          <w:rFonts w:ascii="Times New Roman" w:hAnsi="Times New Roman" w:cs="Times New Roman"/>
+          <w:sz w:val="22"/>
+          <w:szCs w:val="22"/>
+        </w:rPr>
+        <w:t xml:space="preserve">Finding it by hand only proves the bug exists. Finding it through the loop proves that the depth signal </w:t>
+      </w:r>
+      <w:r>
+        <w:rPr>
+          <w:rFonts w:ascii="Times New Roman" w:hAnsi="Times New Roman" w:cs="Times New Roman"/>
+          <w:sz w:val="22"/>
+          <w:szCs w:val="22"/>
+        </w:rPr>
+        <w:t>points</w:t>
+      </w:r>
+      <w:r>
+        <w:rPr>
+          <w:rFonts w:ascii="Times New Roman" w:hAnsi="Times New Roman" w:cs="Times New Roman"/>
+          <w:sz w:val="22"/>
+          <w:szCs w:val="22"/>
+        </w:rPr>
+        <w:t xml:space="preserve"> toward bugs, instead of the loop just happening to trip over one.</w:t>
       </w:r>
     </w:p>
     <w:p>
@@ -546,11 +612,15 @@
         <w:jc w:val="both"/>
         <w:rPr>
           <w:rFonts w:ascii="Times New Roman" w:hAnsi="Times New Roman" w:cs="Times New Roman"/>
-        </w:rPr>
-      </w:pPr>
-      <w:r>
-        <w:rPr>
-          <w:rFonts w:ascii="Times New Roman" w:hAnsi="Times New Roman" w:cs="Times New Roman"/>
+          <w:sz w:val="22"/>
+          <w:szCs w:val="22"/>
+        </w:rPr>
+      </w:pPr>
+      <w:r>
+        <w:rPr>
+          <w:rFonts w:ascii="Times New Roman" w:hAnsi="Times New Roman" w:cs="Times New Roman"/>
+          <w:sz w:val="22"/>
+          <w:szCs w:val="22"/>
         </w:rPr>
         <w:t>Four signatures, one bug</w:t>
       </w:r>
@@ -561,23 +631,23 @@
         <w:jc w:val="both"/>
         <w:rPr>
           <w:rFonts w:ascii="Times New Roman" w:hAnsi="Times New Roman" w:cs="Times New Roman"/>
-          <w:sz w:val="20"/>
-          <w:szCs w:val="20"/>
-        </w:rPr>
-      </w:pPr>
-      <w:r>
-        <w:rPr>
-          <w:rFonts w:ascii="Times New Roman" w:hAnsi="Times New Roman" w:cs="Times New Roman"/>
-          <w:sz w:val="20"/>
-          <w:szCs w:val="20"/>
+          <w:sz w:val="22"/>
+          <w:szCs w:val="22"/>
+        </w:rPr>
+      </w:pPr>
+      <w:r>
+        <w:rPr>
+          <w:rFonts w:ascii="Times New Roman" w:hAnsi="Times New Roman" w:cs="Times New Roman"/>
+          <w:sz w:val="22"/>
+          <w:szCs w:val="22"/>
         </w:rPr>
         <w:t xml:space="preserve">The triage pipeline reported four separate crash signatures. But reading the actual stack traces, all four are the same thing: </w:t>
       </w:r>
       <w:r>
         <w:rPr>
           <w:rFonts w:ascii="Times New Roman" w:eastAsia="Consolas" w:hAnsi="Times New Roman" w:cs="Times New Roman"/>
-          <w:sz w:val="20"/>
-          <w:szCs w:val="20"/>
+          <w:sz w:val="22"/>
+          <w:szCs w:val="22"/>
           <w:shd w:val="clear" w:color="auto" w:fill="F0F0F0"/>
         </w:rPr>
         <w:t>AddressSanitizer: stack-overflow</w:t>
@@ -585,8 +655,8 @@
       <w:r>
         <w:rPr>
           <w:rFonts w:ascii="Times New Roman" w:hAnsi="Times New Roman" w:cs="Times New Roman"/>
-          <w:sz w:val="20"/>
-          <w:szCs w:val="20"/>
+          <w:sz w:val="22"/>
+          <w:szCs w:val="22"/>
         </w:rPr>
         <w:t>. They only look different because of what the program happened to be doing right when it ran out of stack space: allocating memory during array growth, duplicating a key, or in one case nothing at all, because the crash unwinder itself ran out of stack. Strip that away, and the real call chain underneath all four is thousands of frames of the same two functions calling themselves with no depth limit:</w:t>
       </w:r>
@@ -597,15 +667,15 @@
         <w:jc w:val="both"/>
         <w:rPr>
           <w:rFonts w:ascii="Times New Roman" w:hAnsi="Times New Roman" w:cs="Times New Roman"/>
-          <w:sz w:val="20"/>
-          <w:szCs w:val="20"/>
+          <w:sz w:val="22"/>
+          <w:szCs w:val="22"/>
         </w:rPr>
       </w:pPr>
       <w:r>
         <w:rPr>
           <w:rFonts w:ascii="Times New Roman" w:eastAsia="Consolas" w:hAnsi="Times New Roman" w:cs="Times New Roman"/>
-          <w:sz w:val="18"/>
-          <w:szCs w:val="18"/>
+          <w:sz w:val="22"/>
+          <w:szCs w:val="22"/>
         </w:rPr>
         <w:t>parse_array -&gt; parse_array -&gt; parse_array -&gt; ...                (array nesting)</w:t>
       </w:r>
@@ -616,15 +686,15 @@
         <w:jc w:val="both"/>
         <w:rPr>
           <w:rFonts w:ascii="Times New Roman" w:hAnsi="Times New Roman" w:cs="Times New Roman"/>
-          <w:sz w:val="20"/>
-          <w:szCs w:val="20"/>
+          <w:sz w:val="22"/>
+          <w:szCs w:val="22"/>
         </w:rPr>
       </w:pPr>
       <w:r>
         <w:rPr>
           <w:rFonts w:ascii="Times New Roman" w:eastAsia="Consolas" w:hAnsi="Times New Roman" w:cs="Times New Roman"/>
-          <w:sz w:val="18"/>
-          <w:szCs w:val="18"/>
+          <w:sz w:val="22"/>
+          <w:szCs w:val="22"/>
         </w:rPr>
         <w:t>parse_inline_table -&gt; parse_keyval -&gt; parse_inline_table -&gt; ...  (inline-table nesting)</w:t>
       </w:r>
@@ -635,8 +705,8 @@
         <w:jc w:val="both"/>
         <w:rPr>
           <w:rFonts w:ascii="Times New Roman" w:hAnsi="Times New Roman" w:cs="Times New Roman"/>
-          <w:sz w:val="6"/>
-          <w:szCs w:val="6"/>
+          <w:sz w:val="22"/>
+          <w:szCs w:val="22"/>
         </w:rPr>
       </w:pPr>
     </w:p>
@@ -646,67 +716,106 @@
         <w:jc w:val="both"/>
         <w:rPr>
           <w:rFonts w:ascii="Times New Roman" w:hAnsi="Times New Roman" w:cs="Times New Roman"/>
-          <w:sz w:val="20"/>
-          <w:szCs w:val="20"/>
-        </w:rPr>
-      </w:pPr>
-      <w:r>
-        <w:rPr>
-          <w:rFonts w:ascii="Times New Roman" w:hAnsi="Times New Roman" w:cs="Times New Roman"/>
-          <w:sz w:val="20"/>
-          <w:szCs w:val="20"/>
+          <w:sz w:val="22"/>
+          <w:szCs w:val="22"/>
+        </w:rPr>
+      </w:pPr>
+      <w:r>
+        <w:rPr>
+          <w:rFonts w:ascii="Times New Roman" w:hAnsi="Times New Roman" w:cs="Times New Roman"/>
+          <w:sz w:val="22"/>
+          <w:szCs w:val="22"/>
         </w:rPr>
         <w:t xml:space="preserve">The primary report admitted that my crash-grouping method had never been tested on a real crash, only a toy one. Here it finally was, and it exposed a real weakness. My method groups crashes by hashing the last few stack frames, but for a stack-overflow bug those frames depend on timing, not on what </w:t>
       </w:r>
       <w:r>
         <w:rPr>
           <w:rFonts w:ascii="Times New Roman" w:hAnsi="Times New Roman" w:cs="Times New Roman"/>
-          <w:sz w:val="20"/>
-          <w:szCs w:val="20"/>
+          <w:sz w:val="22"/>
+          <w:szCs w:val="22"/>
         </w:rPr>
         <w:t>caused</w:t>
       </w:r>
       <w:r>
         <w:rPr>
           <w:rFonts w:ascii="Times New Roman" w:hAnsi="Times New Roman" w:cs="Times New Roman"/>
-          <w:sz w:val="20"/>
-          <w:szCs w:val="20"/>
-        </w:rPr>
-        <w:t xml:space="preserve"> the crash, so one real bug can show up as several different-looking signatures. The loop caught this on its own in iteration 3, noting that the signature count had gone from 3 to 4 but calling it "the same stack-overflow bug family," and correctly stopped spending budget trying to re-find it. </w:t>
-      </w:r>
-      <w:r>
-        <w:rPr>
-          <w:rFonts w:ascii="Times New Roman" w:hAnsi="Times New Roman" w:cs="Times New Roman"/>
-          <w:sz w:val="20"/>
-          <w:szCs w:val="20"/>
+          <w:sz w:val="22"/>
+          <w:szCs w:val="22"/>
+        </w:rPr>
+        <w:t xml:space="preserve"> the crash, so one real bug can show up as several different-looking signatures. </w:t>
+      </w:r>
+      <w:r>
+        <w:rPr>
+          <w:rFonts w:ascii="Times New Roman" w:hAnsi="Times New Roman" w:cs="Times New Roman"/>
+          <w:sz w:val="22"/>
+          <w:szCs w:val="22"/>
+        </w:rPr>
+        <w:t xml:space="preserve">The loop noticed this itself in iteration 3. Its own notes flagged the jump from 3 to 4 signatures as "the same stack-overflow bug family," </w:t>
+      </w:r>
+      <w:r>
+        <w:rPr>
+          <w:rFonts w:ascii="Times New Roman" w:hAnsi="Times New Roman" w:cs="Times New Roman"/>
+          <w:sz w:val="22"/>
+          <w:szCs w:val="22"/>
+        </w:rPr>
+        <w:t>and redirected its budget instead of re-hunting a bug already in hand</w:t>
+      </w:r>
+      <w:r>
+        <w:rPr>
+          <w:rFonts w:ascii="Times New Roman" w:hAnsi="Times New Roman" w:cs="Times New Roman"/>
+          <w:sz w:val="22"/>
+          <w:szCs w:val="22"/>
+        </w:rPr>
+        <w:t>.</w:t>
+      </w:r>
+      <w:r>
+        <w:rPr>
+          <w:rFonts w:ascii="Times New Roman" w:hAnsi="Times New Roman" w:cs="Times New Roman"/>
+          <w:sz w:val="22"/>
+          <w:szCs w:val="22"/>
+        </w:rPr>
+        <w:t xml:space="preserve"> </w:t>
+      </w:r>
+      <w:r>
+        <w:rPr>
+          <w:rFonts w:ascii="Times New Roman" w:hAnsi="Times New Roman" w:cs="Times New Roman"/>
+          <w:sz w:val="22"/>
+          <w:szCs w:val="22"/>
         </w:rPr>
         <w:t>So,</w:t>
       </w:r>
       <w:r>
         <w:rPr>
           <w:rFonts w:ascii="Times New Roman" w:hAnsi="Times New Roman" w:cs="Times New Roman"/>
-          <w:sz w:val="20"/>
-          <w:szCs w:val="20"/>
-        </w:rPr>
-        <w:t xml:space="preserve"> the honest count is </w:t>
-      </w:r>
-      <w:r>
-        <w:rPr>
-          <w:rFonts w:ascii="Times New Roman" w:hAnsi="Times New Roman" w:cs="Times New Roman"/>
-          <w:b/>
-          <w:bCs/>
-          <w:sz w:val="20"/>
-          <w:szCs w:val="20"/>
-        </w:rPr>
-        <w:t>one confirmed bug</w:t>
-      </w:r>
-      <w:r>
-        <w:rPr>
-          <w:rFonts w:ascii="Times New Roman" w:hAnsi="Times New Roman" w:cs="Times New Roman"/>
-          <w:sz w:val="20"/>
-          <w:szCs w:val="20"/>
-        </w:rPr>
-        <w:t>: unbounded recursion, reachable through at least two code paths, that showed up as four raw signatures. I re-ran all four saved crash inputs by hand against the pinned build, five times each. All twenty runs crashed, but the signature itself is not stable: one byte-identical input hashed to four different IDs across those runs, including a fifth ID that never appeared during the campaign at all. The four signatures were never four behaviours.</w:t>
+          <w:sz w:val="22"/>
+          <w:szCs w:val="22"/>
+        </w:rPr>
+        <w:t xml:space="preserve"> the honest count is one confirmed bug: unbounded recursion, reachable through at least two code paths, that showed up as four raw signatures. I re-ran all four saved crash inputs by hand against the pinned build, five times each. All twenty runs </w:t>
+      </w:r>
+      <w:r>
+        <w:rPr>
+          <w:rFonts w:ascii="Times New Roman" w:hAnsi="Times New Roman" w:cs="Times New Roman"/>
+          <w:sz w:val="22"/>
+          <w:szCs w:val="22"/>
+        </w:rPr>
+        <w:lastRenderedPageBreak/>
+        <w:t xml:space="preserve">crashed, but the signature itself is not stable: one byte-identical input hashed to four different IDs across those runs, including a fifth ID that never appeared during the campaign at all. The four signatures were never four </w:t>
+      </w:r>
+      <w:r>
+        <w:rPr>
+          <w:rFonts w:ascii="Times New Roman" w:hAnsi="Times New Roman" w:cs="Times New Roman"/>
+          <w:sz w:val="22"/>
+          <w:szCs w:val="22"/>
+        </w:rPr>
+        <w:t>behaviors</w:t>
+      </w:r>
+      <w:r>
+        <w:rPr>
+          <w:rFonts w:ascii="Times New Roman" w:hAnsi="Times New Roman" w:cs="Times New Roman"/>
+          <w:sz w:val="22"/>
+          <w:szCs w:val="22"/>
+        </w:rPr>
+        <w:t>.</w:t>
       </w:r>
     </w:p>
     <w:p>
@@ -716,11 +825,15 @@
         <w:jc w:val="both"/>
         <w:rPr>
           <w:rFonts w:ascii="Times New Roman" w:hAnsi="Times New Roman" w:cs="Times New Roman"/>
-        </w:rPr>
-      </w:pPr>
-      <w:r>
-        <w:rPr>
-          <w:rFonts w:ascii="Times New Roman" w:hAnsi="Times New Roman" w:cs="Times New Roman"/>
+          <w:sz w:val="22"/>
+          <w:szCs w:val="22"/>
+        </w:rPr>
+      </w:pPr>
+      <w:r>
+        <w:rPr>
+          <w:rFonts w:ascii="Times New Roman" w:hAnsi="Times New Roman" w:cs="Times New Roman"/>
+          <w:sz w:val="22"/>
+          <w:szCs w:val="22"/>
         </w:rPr>
         <w:t>The reproducers are large, and that's expected, not a flaw</w:t>
       </w:r>
@@ -731,49 +844,49 @@
         <w:jc w:val="both"/>
         <w:rPr>
           <w:rFonts w:ascii="Times New Roman" w:hAnsi="Times New Roman" w:cs="Times New Roman"/>
-          <w:sz w:val="20"/>
-          <w:szCs w:val="20"/>
-        </w:rPr>
-      </w:pPr>
-      <w:r>
-        <w:rPr>
-          <w:rFonts w:ascii="Times New Roman" w:hAnsi="Times New Roman" w:cs="Times New Roman"/>
-          <w:sz w:val="20"/>
-          <w:szCs w:val="20"/>
+          <w:sz w:val="22"/>
+          <w:szCs w:val="22"/>
+        </w:rPr>
+      </w:pPr>
+      <w:r>
+        <w:rPr>
+          <w:rFonts w:ascii="Times New Roman" w:hAnsi="Times New Roman" w:cs="Times New Roman"/>
+          <w:sz w:val="22"/>
+          <w:szCs w:val="22"/>
         </w:rPr>
         <w:t xml:space="preserve">Three of the four saved crash inputs are not fully </w:t>
       </w:r>
       <w:r>
         <w:rPr>
           <w:rFonts w:ascii="Times New Roman" w:hAnsi="Times New Roman" w:cs="Times New Roman"/>
-          <w:sz w:val="20"/>
-          <w:szCs w:val="20"/>
+          <w:sz w:val="22"/>
+          <w:szCs w:val="22"/>
         </w:rPr>
         <w:t>minimized and</w:t>
       </w:r>
       <w:r>
         <w:rPr>
           <w:rFonts w:ascii="Times New Roman" w:hAnsi="Times New Roman" w:cs="Times New Roman"/>
-          <w:sz w:val="20"/>
-          <w:szCs w:val="20"/>
+          <w:sz w:val="22"/>
+          <w:szCs w:val="22"/>
         </w:rPr>
         <w:t xml:space="preserve"> range from 53 to 137 KB</w:t>
       </w:r>
       <w:r>
         <w:rPr>
           <w:rFonts w:ascii="Times New Roman" w:hAnsi="Times New Roman" w:cs="Times New Roman"/>
-          <w:sz w:val="20"/>
-          <w:szCs w:val="20"/>
+          <w:sz w:val="22"/>
+          <w:szCs w:val="22"/>
         </w:rPr>
         <w:t>,</w:t>
       </w:r>
       <w:r>
         <w:rPr>
           <w:rFonts w:ascii="Times New Roman" w:hAnsi="Times New Roman" w:cs="Times New Roman"/>
-          <w:sz w:val="20"/>
-          <w:szCs w:val="20"/>
-        </w:rPr>
-        <w:t xml:space="preserve"> because the exact crash depth shifts by roughly a thousand levels from one run to the next, the shrinker's smaller test candidates sometimes don't crash at all. Rather than report a smaller input that might not actually reproduce the bug, the shrinker correctly keeps the original, larger one. </w:t>
+          <w:sz w:val="22"/>
+          <w:szCs w:val="22"/>
+        </w:rPr>
+        <w:t xml:space="preserve"> because the exact crash depth shifts by roughly a thousand levels from one run to the next, the shrinker's smaller test candidates sometimes don't crash at all. Rather than report a smaller input that might not actually reproduce the bug, the shrinker keeps the original, larger one. </w:t>
       </w:r>
     </w:p>
     <w:p>
@@ -783,13 +896,16 @@
         <w:jc w:val="both"/>
         <w:rPr>
           <w:rFonts w:ascii="Times New Roman" w:hAnsi="Times New Roman" w:cs="Times New Roman"/>
-        </w:rPr>
-      </w:pPr>
-      <w:r>
-        <w:rPr>
-          <w:rFonts w:ascii="Times New Roman" w:hAnsi="Times New Roman" w:cs="Times New Roman"/>
-        </w:rPr>
-        <w:lastRenderedPageBreak/>
+          <w:sz w:val="22"/>
+          <w:szCs w:val="22"/>
+        </w:rPr>
+      </w:pPr>
+      <w:r>
+        <w:rPr>
+          <w:rFonts w:ascii="Times New Roman" w:hAnsi="Times New Roman" w:cs="Times New Roman"/>
+          <w:sz w:val="22"/>
+          <w:szCs w:val="22"/>
+        </w:rPr>
         <w:t>How the generator changed over five rounds</w:t>
       </w:r>
     </w:p>
@@ -811,11 +927,11 @@
         <w:tblLook w:val="04A0" w:firstRow="1" w:lastRow="0" w:firstColumn="1" w:lastColumn="0" w:noHBand="0" w:noVBand="1"/>
       </w:tblPr>
       <w:tblGrid>
-        <w:gridCol w:w="1386"/>
-        <w:gridCol w:w="1129"/>
-        <w:gridCol w:w="990"/>
-        <w:gridCol w:w="1170"/>
-        <w:gridCol w:w="4685"/>
+        <w:gridCol w:w="886"/>
+        <w:gridCol w:w="1096"/>
+        <w:gridCol w:w="983"/>
+        <w:gridCol w:w="1074"/>
+        <w:gridCol w:w="5321"/>
       </w:tblGrid>
       <w:tr>
         <w:trPr>
@@ -824,16 +940,16 @@
         </w:trPr>
         <w:tc>
           <w:tcPr>
-            <w:tcW w:w="1386" w:type="dxa"/>
+            <w:tcW w:w="887" w:type="dxa"/>
             <w:shd w:val="clear" w:color="auto" w:fill="E8E8E8"/>
           </w:tcPr>
           <w:p>
             <w:pPr>
-              <w:jc w:val="both"/>
-              <w:rPr>
-                <w:rFonts w:ascii="Times New Roman" w:hAnsi="Times New Roman" w:cs="Times New Roman"/>
-                <w:sz w:val="20"/>
-                <w:szCs w:val="20"/>
+              <w:jc w:val="center"/>
+              <w:rPr>
+                <w:rFonts w:ascii="Times New Roman" w:hAnsi="Times New Roman" w:cs="Times New Roman"/>
+                <w:sz w:val="22"/>
+                <w:szCs w:val="22"/>
               </w:rPr>
             </w:pPr>
             <w:r>
@@ -841,8 +957,8 @@
                 <w:rFonts w:ascii="Times New Roman" w:hAnsi="Times New Roman" w:cs="Times New Roman"/>
                 <w:b/>
                 <w:bCs/>
-                <w:sz w:val="20"/>
-                <w:szCs w:val="20"/>
+                <w:sz w:val="22"/>
+                <w:szCs w:val="22"/>
               </w:rPr>
               <w:t>Iteration</w:t>
             </w:r>
@@ -850,16 +966,16 @@
         </w:tc>
         <w:tc>
           <w:tcPr>
-            <w:tcW w:w="1129" w:type="dxa"/>
+            <w:tcW w:w="998" w:type="dxa"/>
             <w:shd w:val="clear" w:color="auto" w:fill="E8E8E8"/>
           </w:tcPr>
           <w:p>
             <w:pPr>
-              <w:jc w:val="both"/>
-              <w:rPr>
-                <w:rFonts w:ascii="Times New Roman" w:hAnsi="Times New Roman" w:cs="Times New Roman"/>
-                <w:sz w:val="20"/>
-                <w:szCs w:val="20"/>
+              <w:jc w:val="center"/>
+              <w:rPr>
+                <w:rFonts w:ascii="Times New Roman" w:hAnsi="Times New Roman" w:cs="Times New Roman"/>
+                <w:sz w:val="22"/>
+                <w:szCs w:val="22"/>
               </w:rPr>
             </w:pPr>
             <w:r>
@@ -867,8 +983,8 @@
                 <w:rFonts w:ascii="Times New Roman" w:hAnsi="Times New Roman" w:cs="Times New Roman"/>
                 <w:b/>
                 <w:bCs/>
-                <w:sz w:val="20"/>
-                <w:szCs w:val="20"/>
+                <w:sz w:val="22"/>
+                <w:szCs w:val="22"/>
               </w:rPr>
               <w:t>Acceptance</w:t>
             </w:r>
@@ -881,11 +997,11 @@
           </w:tcPr>
           <w:p>
             <w:pPr>
-              <w:jc w:val="both"/>
-              <w:rPr>
-                <w:rFonts w:ascii="Times New Roman" w:hAnsi="Times New Roman" w:cs="Times New Roman"/>
-                <w:sz w:val="20"/>
-                <w:szCs w:val="20"/>
+              <w:jc w:val="center"/>
+              <w:rPr>
+                <w:rFonts w:ascii="Times New Roman" w:hAnsi="Times New Roman" w:cs="Times New Roman"/>
+                <w:sz w:val="22"/>
+                <w:szCs w:val="22"/>
               </w:rPr>
             </w:pPr>
             <w:r>
@@ -893,8 +1009,8 @@
                 <w:rFonts w:ascii="Times New Roman" w:hAnsi="Times New Roman" w:cs="Times New Roman"/>
                 <w:b/>
                 <w:bCs/>
-                <w:sz w:val="20"/>
-                <w:szCs w:val="20"/>
+                <w:sz w:val="22"/>
+                <w:szCs w:val="22"/>
               </w:rPr>
               <w:t>Max depth</w:t>
             </w:r>
@@ -902,7 +1018,7 @@
         </w:tc>
         <w:tc>
           <w:tcPr>
-            <w:tcW w:w="1170" w:type="dxa"/>
+            <w:tcW w:w="1080" w:type="dxa"/>
             <w:shd w:val="clear" w:color="auto" w:fill="E8E8E8"/>
           </w:tcPr>
           <w:p>
@@ -910,8 +1026,8 @@
               <w:jc w:val="center"/>
               <w:rPr>
                 <w:rFonts w:ascii="Times New Roman" w:hAnsi="Times New Roman" w:cs="Times New Roman"/>
-                <w:sz w:val="20"/>
-                <w:szCs w:val="20"/>
+                <w:sz w:val="22"/>
+                <w:szCs w:val="22"/>
               </w:rPr>
             </w:pPr>
             <w:r>
@@ -919,8 +1035,8 @@
                 <w:rFonts w:ascii="Times New Roman" w:hAnsi="Times New Roman" w:cs="Times New Roman"/>
                 <w:b/>
                 <w:bCs/>
-                <w:sz w:val="20"/>
-                <w:szCs w:val="20"/>
+                <w:sz w:val="22"/>
+                <w:szCs w:val="22"/>
               </w:rPr>
               <w:t>Crashes</w:t>
             </w:r>
@@ -928,16 +1044,16 @@
         </w:tc>
         <w:tc>
           <w:tcPr>
-            <w:tcW w:w="4685" w:type="dxa"/>
+            <w:tcW w:w="5405" w:type="dxa"/>
             <w:shd w:val="clear" w:color="auto" w:fill="E8E8E8"/>
           </w:tcPr>
           <w:p>
             <w:pPr>
-              <w:jc w:val="both"/>
-              <w:rPr>
-                <w:rFonts w:ascii="Times New Roman" w:hAnsi="Times New Roman" w:cs="Times New Roman"/>
-                <w:sz w:val="20"/>
-                <w:szCs w:val="20"/>
+              <w:jc w:val="center"/>
+              <w:rPr>
+                <w:rFonts w:ascii="Times New Roman" w:hAnsi="Times New Roman" w:cs="Times New Roman"/>
+                <w:sz w:val="22"/>
+                <w:szCs w:val="22"/>
               </w:rPr>
             </w:pPr>
             <w:r>
@@ -945,8 +1061,8 @@
                 <w:rFonts w:ascii="Times New Roman" w:hAnsi="Times New Roman" w:cs="Times New Roman"/>
                 <w:b/>
                 <w:bCs/>
-                <w:sz w:val="20"/>
-                <w:szCs w:val="20"/>
+                <w:sz w:val="22"/>
+                <w:szCs w:val="22"/>
               </w:rPr>
               <w:t>What changed</w:t>
             </w:r>
@@ -956,22 +1072,23 @@
       <w:tr>
         <w:tc>
           <w:tcPr>
-            <w:tcW w:w="1386" w:type="dxa"/>
+            <w:tcW w:w="887" w:type="dxa"/>
           </w:tcPr>
           <w:p>
             <w:pPr>
+              <w:spacing w:line="360" w:lineRule="auto"/>
               <w:jc w:val="center"/>
               <w:rPr>
                 <w:rFonts w:ascii="Times New Roman" w:hAnsi="Times New Roman" w:cs="Times New Roman"/>
-                <w:sz w:val="20"/>
-                <w:szCs w:val="20"/>
+                <w:sz w:val="22"/>
+                <w:szCs w:val="22"/>
               </w:rPr>
             </w:pPr>
             <w:r>
               <w:rPr>
                 <w:rFonts w:ascii="Times New Roman" w:hAnsi="Times New Roman" w:cs="Times New Roman"/>
-                <w:sz w:val="20"/>
-                <w:szCs w:val="20"/>
+                <w:sz w:val="22"/>
+                <w:szCs w:val="22"/>
               </w:rPr>
               <w:t>0</w:t>
             </w:r>
@@ -979,22 +1096,23 @@
         </w:tc>
         <w:tc>
           <w:tcPr>
-            <w:tcW w:w="1129" w:type="dxa"/>
+            <w:tcW w:w="998" w:type="dxa"/>
           </w:tcPr>
           <w:p>
             <w:pPr>
+              <w:spacing w:line="360" w:lineRule="auto"/>
               <w:jc w:val="center"/>
               <w:rPr>
                 <w:rFonts w:ascii="Times New Roman" w:hAnsi="Times New Roman" w:cs="Times New Roman"/>
-                <w:sz w:val="20"/>
-                <w:szCs w:val="20"/>
+                <w:sz w:val="22"/>
+                <w:szCs w:val="22"/>
               </w:rPr>
             </w:pPr>
             <w:r>
               <w:rPr>
                 <w:rFonts w:ascii="Times New Roman" w:hAnsi="Times New Roman" w:cs="Times New Roman"/>
-                <w:sz w:val="20"/>
-                <w:szCs w:val="20"/>
+                <w:sz w:val="22"/>
+                <w:szCs w:val="22"/>
               </w:rPr>
               <w:t>6.2%</w:t>
             </w:r>
@@ -1006,18 +1124,19 @@
           </w:tcPr>
           <w:p>
             <w:pPr>
+              <w:spacing w:line="360" w:lineRule="auto"/>
               <w:jc w:val="center"/>
               <w:rPr>
                 <w:rFonts w:ascii="Times New Roman" w:hAnsi="Times New Roman" w:cs="Times New Roman"/>
-                <w:sz w:val="20"/>
-                <w:szCs w:val="20"/>
+                <w:sz w:val="22"/>
+                <w:szCs w:val="22"/>
               </w:rPr>
             </w:pPr>
             <w:r>
               <w:rPr>
                 <w:rFonts w:ascii="Times New Roman" w:hAnsi="Times New Roman" w:cs="Times New Roman"/>
-                <w:sz w:val="20"/>
-                <w:szCs w:val="20"/>
+                <w:sz w:val="22"/>
+                <w:szCs w:val="22"/>
               </w:rPr>
               <w:t>25,704</w:t>
             </w:r>
@@ -1025,22 +1144,23 @@
         </w:tc>
         <w:tc>
           <w:tcPr>
-            <w:tcW w:w="1170" w:type="dxa"/>
+            <w:tcW w:w="1080" w:type="dxa"/>
           </w:tcPr>
           <w:p>
             <w:pPr>
+              <w:spacing w:line="360" w:lineRule="auto"/>
               <w:jc w:val="center"/>
               <w:rPr>
                 <w:rFonts w:ascii="Times New Roman" w:hAnsi="Times New Roman" w:cs="Times New Roman"/>
-                <w:sz w:val="20"/>
-                <w:szCs w:val="20"/>
+                <w:sz w:val="22"/>
+                <w:szCs w:val="22"/>
               </w:rPr>
             </w:pPr>
             <w:r>
               <w:rPr>
                 <w:rFonts w:ascii="Times New Roman" w:hAnsi="Times New Roman" w:cs="Times New Roman"/>
-                <w:sz w:val="20"/>
-                <w:szCs w:val="20"/>
+                <w:sz w:val="22"/>
+                <w:szCs w:val="22"/>
               </w:rPr>
               <w:t>0</w:t>
             </w:r>
@@ -1048,21 +1168,22 @@
         </w:tc>
         <w:tc>
           <w:tcPr>
-            <w:tcW w:w="4685" w:type="dxa"/>
+            <w:tcW w:w="5405" w:type="dxa"/>
           </w:tcPr>
           <w:p>
             <w:pPr>
-              <w:rPr>
-                <w:rFonts w:ascii="Times New Roman" w:hAnsi="Times New Roman" w:cs="Times New Roman"/>
-                <w:sz w:val="20"/>
-                <w:szCs w:val="20"/>
+              <w:spacing w:line="360" w:lineRule="auto"/>
+              <w:rPr>
+                <w:rFonts w:ascii="Times New Roman" w:hAnsi="Times New Roman" w:cs="Times New Roman"/>
+                <w:sz w:val="22"/>
+                <w:szCs w:val="22"/>
               </w:rPr>
             </w:pPr>
             <w:r>
               <w:rPr>
                 <w:rFonts w:ascii="Times New Roman" w:hAnsi="Times New Roman" w:cs="Times New Roman"/>
-                <w:sz w:val="20"/>
-                <w:szCs w:val="20"/>
+                <w:sz w:val="22"/>
+                <w:szCs w:val="22"/>
               </w:rPr>
               <w:t>first version, seeded from the grammar and measured gaps</w:t>
             </w:r>
@@ -1072,22 +1193,23 @@
       <w:tr>
         <w:tc>
           <w:tcPr>
-            <w:tcW w:w="1386" w:type="dxa"/>
+            <w:tcW w:w="887" w:type="dxa"/>
           </w:tcPr>
           <w:p>
             <w:pPr>
+              <w:spacing w:line="360" w:lineRule="auto"/>
               <w:jc w:val="center"/>
               <w:rPr>
                 <w:rFonts w:ascii="Times New Roman" w:hAnsi="Times New Roman" w:cs="Times New Roman"/>
-                <w:sz w:val="20"/>
-                <w:szCs w:val="20"/>
+                <w:sz w:val="22"/>
+                <w:szCs w:val="22"/>
               </w:rPr>
             </w:pPr>
             <w:r>
               <w:rPr>
                 <w:rFonts w:ascii="Times New Roman" w:hAnsi="Times New Roman" w:cs="Times New Roman"/>
-                <w:sz w:val="20"/>
-                <w:szCs w:val="20"/>
+                <w:sz w:val="22"/>
+                <w:szCs w:val="22"/>
               </w:rPr>
               <w:t>1</w:t>
             </w:r>
@@ -1095,22 +1217,23 @@
         </w:tc>
         <w:tc>
           <w:tcPr>
-            <w:tcW w:w="1129" w:type="dxa"/>
+            <w:tcW w:w="998" w:type="dxa"/>
           </w:tcPr>
           <w:p>
             <w:pPr>
+              <w:spacing w:line="360" w:lineRule="auto"/>
               <w:jc w:val="center"/>
               <w:rPr>
                 <w:rFonts w:ascii="Times New Roman" w:hAnsi="Times New Roman" w:cs="Times New Roman"/>
-                <w:sz w:val="20"/>
-                <w:szCs w:val="20"/>
+                <w:sz w:val="22"/>
+                <w:szCs w:val="22"/>
               </w:rPr>
             </w:pPr>
             <w:r>
               <w:rPr>
                 <w:rFonts w:ascii="Times New Roman" w:hAnsi="Times New Roman" w:cs="Times New Roman"/>
-                <w:sz w:val="20"/>
-                <w:szCs w:val="20"/>
+                <w:sz w:val="22"/>
+                <w:szCs w:val="22"/>
               </w:rPr>
               <w:t>43.0%</w:t>
             </w:r>
@@ -1122,18 +1245,19 @@
           </w:tcPr>
           <w:p>
             <w:pPr>
+              <w:spacing w:line="360" w:lineRule="auto"/>
               <w:jc w:val="center"/>
               <w:rPr>
                 <w:rFonts w:ascii="Times New Roman" w:hAnsi="Times New Roman" w:cs="Times New Roman"/>
-                <w:sz w:val="20"/>
-                <w:szCs w:val="20"/>
+                <w:sz w:val="22"/>
+                <w:szCs w:val="22"/>
               </w:rPr>
             </w:pPr>
             <w:r>
               <w:rPr>
                 <w:rFonts w:ascii="Times New Roman" w:hAnsi="Times New Roman" w:cs="Times New Roman"/>
-                <w:sz w:val="20"/>
-                <w:szCs w:val="20"/>
+                <w:sz w:val="22"/>
+                <w:szCs w:val="22"/>
               </w:rPr>
               <w:t>33,701</w:t>
             </w:r>
@@ -1141,22 +1265,23 @@
         </w:tc>
         <w:tc>
           <w:tcPr>
-            <w:tcW w:w="1170" w:type="dxa"/>
+            <w:tcW w:w="1080" w:type="dxa"/>
           </w:tcPr>
           <w:p>
             <w:pPr>
+              <w:spacing w:line="360" w:lineRule="auto"/>
               <w:jc w:val="center"/>
               <w:rPr>
                 <w:rFonts w:ascii="Times New Roman" w:hAnsi="Times New Roman" w:cs="Times New Roman"/>
-                <w:sz w:val="20"/>
-                <w:szCs w:val="20"/>
+                <w:sz w:val="22"/>
+                <w:szCs w:val="22"/>
               </w:rPr>
             </w:pPr>
             <w:r>
               <w:rPr>
                 <w:rFonts w:ascii="Times New Roman" w:hAnsi="Times New Roman" w:cs="Times New Roman"/>
-                <w:sz w:val="20"/>
-                <w:szCs w:val="20"/>
+                <w:sz w:val="22"/>
+                <w:szCs w:val="22"/>
               </w:rPr>
               <w:t>3</w:t>
             </w:r>
@@ -1164,21 +1289,22 @@
         </w:tc>
         <w:tc>
           <w:tcPr>
-            <w:tcW w:w="4685" w:type="dxa"/>
+            <w:tcW w:w="5405" w:type="dxa"/>
           </w:tcPr>
           <w:p>
             <w:pPr>
-              <w:rPr>
-                <w:rFonts w:ascii="Times New Roman" w:hAnsi="Times New Roman" w:cs="Times New Roman"/>
-                <w:sz w:val="20"/>
-                <w:szCs w:val="20"/>
+              <w:spacing w:line="360" w:lineRule="auto"/>
+              <w:rPr>
+                <w:rFonts w:ascii="Times New Roman" w:hAnsi="Times New Roman" w:cs="Times New Roman"/>
+                <w:sz w:val="22"/>
+                <w:szCs w:val="22"/>
               </w:rPr>
             </w:pPr>
             <w:r>
               <w:rPr>
                 <w:rFonts w:ascii="Times New Roman" w:hAnsi="Times New Roman" w:cs="Times New Roman"/>
-                <w:sz w:val="20"/>
-                <w:szCs w:val="20"/>
+                <w:sz w:val="22"/>
+                <w:szCs w:val="22"/>
               </w:rPr>
               <w:t>moved deep nesting into its own strategy</w:t>
             </w:r>
@@ -1188,22 +1314,23 @@
       <w:tr>
         <w:tc>
           <w:tcPr>
-            <w:tcW w:w="1386" w:type="dxa"/>
+            <w:tcW w:w="887" w:type="dxa"/>
           </w:tcPr>
           <w:p>
             <w:pPr>
+              <w:spacing w:line="360" w:lineRule="auto"/>
               <w:jc w:val="center"/>
               <w:rPr>
                 <w:rFonts w:ascii="Times New Roman" w:hAnsi="Times New Roman" w:cs="Times New Roman"/>
-                <w:sz w:val="20"/>
-                <w:szCs w:val="20"/>
+                <w:sz w:val="22"/>
+                <w:szCs w:val="22"/>
               </w:rPr>
             </w:pPr>
             <w:r>
               <w:rPr>
                 <w:rFonts w:ascii="Times New Roman" w:hAnsi="Times New Roman" w:cs="Times New Roman"/>
-                <w:sz w:val="20"/>
-                <w:szCs w:val="20"/>
+                <w:sz w:val="22"/>
+                <w:szCs w:val="22"/>
               </w:rPr>
               <w:t>2</w:t>
             </w:r>
@@ -1211,22 +1338,23 @@
         </w:tc>
         <w:tc>
           <w:tcPr>
-            <w:tcW w:w="1129" w:type="dxa"/>
+            <w:tcW w:w="998" w:type="dxa"/>
           </w:tcPr>
           <w:p>
             <w:pPr>
+              <w:spacing w:line="360" w:lineRule="auto"/>
               <w:jc w:val="center"/>
               <w:rPr>
                 <w:rFonts w:ascii="Times New Roman" w:hAnsi="Times New Roman" w:cs="Times New Roman"/>
-                <w:sz w:val="20"/>
-                <w:szCs w:val="20"/>
+                <w:sz w:val="22"/>
+                <w:szCs w:val="22"/>
               </w:rPr>
             </w:pPr>
             <w:r>
               <w:rPr>
                 <w:rFonts w:ascii="Times New Roman" w:hAnsi="Times New Roman" w:cs="Times New Roman"/>
-                <w:sz w:val="20"/>
-                <w:szCs w:val="20"/>
+                <w:sz w:val="22"/>
+                <w:szCs w:val="22"/>
               </w:rPr>
               <w:t>39.4%</w:t>
             </w:r>
@@ -1238,18 +1366,19 @@
           </w:tcPr>
           <w:p>
             <w:pPr>
+              <w:spacing w:line="360" w:lineRule="auto"/>
               <w:jc w:val="center"/>
               <w:rPr>
                 <w:rFonts w:ascii="Times New Roman" w:hAnsi="Times New Roman" w:cs="Times New Roman"/>
-                <w:sz w:val="20"/>
-                <w:szCs w:val="20"/>
+                <w:sz w:val="22"/>
+                <w:szCs w:val="22"/>
               </w:rPr>
             </w:pPr>
             <w:r>
               <w:rPr>
                 <w:rFonts w:ascii="Times New Roman" w:hAnsi="Times New Roman" w:cs="Times New Roman"/>
-                <w:sz w:val="20"/>
-                <w:szCs w:val="20"/>
+                <w:sz w:val="22"/>
+                <w:szCs w:val="22"/>
               </w:rPr>
               <w:t>31,381</w:t>
             </w:r>
@@ -1257,22 +1386,23 @@
         </w:tc>
         <w:tc>
           <w:tcPr>
-            <w:tcW w:w="1170" w:type="dxa"/>
+            <w:tcW w:w="1080" w:type="dxa"/>
           </w:tcPr>
           <w:p>
             <w:pPr>
+              <w:spacing w:line="360" w:lineRule="auto"/>
               <w:jc w:val="center"/>
               <w:rPr>
                 <w:rFonts w:ascii="Times New Roman" w:hAnsi="Times New Roman" w:cs="Times New Roman"/>
-                <w:sz w:val="20"/>
-                <w:szCs w:val="20"/>
+                <w:sz w:val="22"/>
+                <w:szCs w:val="22"/>
               </w:rPr>
             </w:pPr>
             <w:r>
               <w:rPr>
                 <w:rFonts w:ascii="Times New Roman" w:hAnsi="Times New Roman" w:cs="Times New Roman"/>
-                <w:sz w:val="20"/>
-                <w:szCs w:val="20"/>
+                <w:sz w:val="22"/>
+                <w:szCs w:val="22"/>
               </w:rPr>
               <w:t>4</w:t>
             </w:r>
@@ -1280,21 +1410,22 @@
         </w:tc>
         <w:tc>
           <w:tcPr>
-            <w:tcW w:w="4685" w:type="dxa"/>
+            <w:tcW w:w="5405" w:type="dxa"/>
           </w:tcPr>
           <w:p>
             <w:pPr>
-              <w:rPr>
-                <w:rFonts w:ascii="Times New Roman" w:hAnsi="Times New Roman" w:cs="Times New Roman"/>
-                <w:sz w:val="20"/>
-                <w:szCs w:val="20"/>
+              <w:spacing w:line="360" w:lineRule="auto"/>
+              <w:rPr>
+                <w:rFonts w:ascii="Times New Roman" w:hAnsi="Times New Roman" w:cs="Times New Roman"/>
+                <w:sz w:val="22"/>
+                <w:szCs w:val="22"/>
               </w:rPr>
             </w:pPr>
             <w:r>
               <w:rPr>
                 <w:rFonts w:ascii="Times New Roman" w:hAnsi="Times New Roman" w:cs="Times New Roman"/>
-                <w:sz w:val="20"/>
-                <w:szCs w:val="20"/>
+                <w:sz w:val="22"/>
+                <w:szCs w:val="22"/>
               </w:rPr>
               <w:t>found the crash, then reduced how aggressively it nested</w:t>
             </w:r>
@@ -1304,22 +1435,23 @@
       <w:tr>
         <w:tc>
           <w:tcPr>
-            <w:tcW w:w="1386" w:type="dxa"/>
+            <w:tcW w:w="887" w:type="dxa"/>
           </w:tcPr>
           <w:p>
             <w:pPr>
+              <w:spacing w:line="360" w:lineRule="auto"/>
               <w:jc w:val="center"/>
               <w:rPr>
                 <w:rFonts w:ascii="Times New Roman" w:hAnsi="Times New Roman" w:cs="Times New Roman"/>
-                <w:sz w:val="20"/>
-                <w:szCs w:val="20"/>
+                <w:sz w:val="22"/>
+                <w:szCs w:val="22"/>
               </w:rPr>
             </w:pPr>
             <w:r>
               <w:rPr>
                 <w:rFonts w:ascii="Times New Roman" w:hAnsi="Times New Roman" w:cs="Times New Roman"/>
-                <w:sz w:val="20"/>
-                <w:szCs w:val="20"/>
+                <w:sz w:val="22"/>
+                <w:szCs w:val="22"/>
               </w:rPr>
               <w:t>3</w:t>
             </w:r>
@@ -1327,22 +1459,23 @@
         </w:tc>
         <w:tc>
           <w:tcPr>
-            <w:tcW w:w="1129" w:type="dxa"/>
+            <w:tcW w:w="998" w:type="dxa"/>
           </w:tcPr>
           <w:p>
             <w:pPr>
+              <w:spacing w:line="360" w:lineRule="auto"/>
               <w:jc w:val="center"/>
               <w:rPr>
                 <w:rFonts w:ascii="Times New Roman" w:hAnsi="Times New Roman" w:cs="Times New Roman"/>
-                <w:sz w:val="20"/>
-                <w:szCs w:val="20"/>
+                <w:sz w:val="22"/>
+                <w:szCs w:val="22"/>
               </w:rPr>
             </w:pPr>
             <w:r>
               <w:rPr>
                 <w:rFonts w:ascii="Times New Roman" w:hAnsi="Times New Roman" w:cs="Times New Roman"/>
-                <w:sz w:val="20"/>
-                <w:szCs w:val="20"/>
+                <w:sz w:val="22"/>
+                <w:szCs w:val="22"/>
               </w:rPr>
               <w:t>28.8%</w:t>
             </w:r>
@@ -1354,18 +1487,19 @@
           </w:tcPr>
           <w:p>
             <w:pPr>
+              <w:spacing w:line="360" w:lineRule="auto"/>
               <w:jc w:val="center"/>
               <w:rPr>
                 <w:rFonts w:ascii="Times New Roman" w:hAnsi="Times New Roman" w:cs="Times New Roman"/>
-                <w:sz w:val="20"/>
-                <w:szCs w:val="20"/>
+                <w:sz w:val="22"/>
+                <w:szCs w:val="22"/>
               </w:rPr>
             </w:pPr>
             <w:r>
               <w:rPr>
                 <w:rFonts w:ascii="Times New Roman" w:hAnsi="Times New Roman" w:cs="Times New Roman"/>
-                <w:sz w:val="20"/>
-                <w:szCs w:val="20"/>
+                <w:sz w:val="22"/>
+                <w:szCs w:val="22"/>
               </w:rPr>
               <w:t>33,347</w:t>
             </w:r>
@@ -1373,22 +1507,23 @@
         </w:tc>
         <w:tc>
           <w:tcPr>
-            <w:tcW w:w="1170" w:type="dxa"/>
+            <w:tcW w:w="1080" w:type="dxa"/>
           </w:tcPr>
           <w:p>
             <w:pPr>
+              <w:spacing w:line="360" w:lineRule="auto"/>
               <w:jc w:val="center"/>
               <w:rPr>
                 <w:rFonts w:ascii="Times New Roman" w:hAnsi="Times New Roman" w:cs="Times New Roman"/>
-                <w:sz w:val="20"/>
-                <w:szCs w:val="20"/>
+                <w:sz w:val="22"/>
+                <w:szCs w:val="22"/>
               </w:rPr>
             </w:pPr>
             <w:r>
               <w:rPr>
                 <w:rFonts w:ascii="Times New Roman" w:hAnsi="Times New Roman" w:cs="Times New Roman"/>
-                <w:sz w:val="20"/>
-                <w:szCs w:val="20"/>
+                <w:sz w:val="22"/>
+                <w:szCs w:val="22"/>
               </w:rPr>
               <w:t>1 (re-hit)</w:t>
             </w:r>
@@ -1396,21 +1531,22 @@
         </w:tc>
         <w:tc>
           <w:tcPr>
-            <w:tcW w:w="4685" w:type="dxa"/>
+            <w:tcW w:w="5405" w:type="dxa"/>
           </w:tcPr>
           <w:p>
             <w:pPr>
-              <w:rPr>
-                <w:rFonts w:ascii="Times New Roman" w:hAnsi="Times New Roman" w:cs="Times New Roman"/>
-                <w:sz w:val="20"/>
-                <w:szCs w:val="20"/>
+              <w:spacing w:line="360" w:lineRule="auto"/>
+              <w:rPr>
+                <w:rFonts w:ascii="Times New Roman" w:hAnsi="Times New Roman" w:cs="Times New Roman"/>
+                <w:sz w:val="22"/>
+                <w:szCs w:val="22"/>
               </w:rPr>
             </w:pPr>
             <w:r>
               <w:rPr>
                 <w:rFonts w:ascii="Times New Roman" w:hAnsi="Times New Roman" w:cs="Times New Roman"/>
-                <w:sz w:val="20"/>
-                <w:szCs w:val="20"/>
+                <w:sz w:val="22"/>
+                <w:szCs w:val="22"/>
               </w:rPr>
               <w:t>recognized it was one bug family, shifted focus to acceptance</w:t>
             </w:r>
@@ -1420,22 +1556,23 @@
       <w:tr>
         <w:tc>
           <w:tcPr>
-            <w:tcW w:w="1386" w:type="dxa"/>
+            <w:tcW w:w="887" w:type="dxa"/>
           </w:tcPr>
           <w:p>
             <w:pPr>
+              <w:spacing w:line="360" w:lineRule="auto"/>
               <w:jc w:val="center"/>
               <w:rPr>
                 <w:rFonts w:ascii="Times New Roman" w:hAnsi="Times New Roman" w:cs="Times New Roman"/>
-                <w:sz w:val="20"/>
-                <w:szCs w:val="20"/>
+                <w:sz w:val="22"/>
+                <w:szCs w:val="22"/>
               </w:rPr>
             </w:pPr>
             <w:r>
               <w:rPr>
                 <w:rFonts w:ascii="Times New Roman" w:hAnsi="Times New Roman" w:cs="Times New Roman"/>
-                <w:sz w:val="20"/>
-                <w:szCs w:val="20"/>
+                <w:sz w:val="22"/>
+                <w:szCs w:val="22"/>
               </w:rPr>
               <w:t>4</w:t>
             </w:r>
@@ -1443,22 +1580,23 @@
         </w:tc>
         <w:tc>
           <w:tcPr>
-            <w:tcW w:w="1129" w:type="dxa"/>
+            <w:tcW w:w="998" w:type="dxa"/>
           </w:tcPr>
           <w:p>
             <w:pPr>
+              <w:spacing w:line="360" w:lineRule="auto"/>
               <w:jc w:val="center"/>
               <w:rPr>
                 <w:rFonts w:ascii="Times New Roman" w:hAnsi="Times New Roman" w:cs="Times New Roman"/>
-                <w:sz w:val="20"/>
-                <w:szCs w:val="20"/>
+                <w:sz w:val="22"/>
+                <w:szCs w:val="22"/>
               </w:rPr>
             </w:pPr>
             <w:r>
               <w:rPr>
                 <w:rFonts w:ascii="Times New Roman" w:hAnsi="Times New Roman" w:cs="Times New Roman"/>
-                <w:sz w:val="20"/>
-                <w:szCs w:val="20"/>
+                <w:sz w:val="22"/>
+                <w:szCs w:val="22"/>
               </w:rPr>
               <w:t>48.0%</w:t>
             </w:r>
@@ -1470,18 +1608,19 @@
           </w:tcPr>
           <w:p>
             <w:pPr>
+              <w:spacing w:line="360" w:lineRule="auto"/>
               <w:jc w:val="center"/>
               <w:rPr>
                 <w:rFonts w:ascii="Times New Roman" w:hAnsi="Times New Roman" w:cs="Times New Roman"/>
-                <w:sz w:val="20"/>
-                <w:szCs w:val="20"/>
+                <w:sz w:val="22"/>
+                <w:szCs w:val="22"/>
               </w:rPr>
             </w:pPr>
             <w:r>
               <w:rPr>
                 <w:rFonts w:ascii="Times New Roman" w:hAnsi="Times New Roman" w:cs="Times New Roman"/>
-                <w:sz w:val="20"/>
-                <w:szCs w:val="20"/>
+                <w:sz w:val="22"/>
+                <w:szCs w:val="22"/>
               </w:rPr>
               <w:t>21,594</w:t>
             </w:r>
@@ -1489,22 +1628,23 @@
         </w:tc>
         <w:tc>
           <w:tcPr>
-            <w:tcW w:w="1170" w:type="dxa"/>
+            <w:tcW w:w="1080" w:type="dxa"/>
           </w:tcPr>
           <w:p>
             <w:pPr>
+              <w:spacing w:line="360" w:lineRule="auto"/>
               <w:jc w:val="center"/>
               <w:rPr>
                 <w:rFonts w:ascii="Times New Roman" w:hAnsi="Times New Roman" w:cs="Times New Roman"/>
-                <w:sz w:val="20"/>
-                <w:szCs w:val="20"/>
+                <w:sz w:val="22"/>
+                <w:szCs w:val="22"/>
               </w:rPr>
             </w:pPr>
             <w:r>
               <w:rPr>
                 <w:rFonts w:ascii="Times New Roman" w:hAnsi="Times New Roman" w:cs="Times New Roman"/>
-                <w:sz w:val="20"/>
-                <w:szCs w:val="20"/>
+                <w:sz w:val="22"/>
+                <w:szCs w:val="22"/>
               </w:rPr>
               <w:t>0</w:t>
             </w:r>
@@ -1512,21 +1652,22 @@
         </w:tc>
         <w:tc>
           <w:tcPr>
-            <w:tcW w:w="4685" w:type="dxa"/>
+            <w:tcW w:w="5405" w:type="dxa"/>
           </w:tcPr>
           <w:p>
             <w:pPr>
-              <w:rPr>
-                <w:rFonts w:ascii="Times New Roman" w:hAnsi="Times New Roman" w:cs="Times New Roman"/>
-                <w:sz w:val="20"/>
-                <w:szCs w:val="20"/>
+              <w:spacing w:line="360" w:lineRule="auto"/>
+              <w:rPr>
+                <w:rFonts w:ascii="Times New Roman" w:hAnsi="Times New Roman" w:cs="Times New Roman"/>
+                <w:sz w:val="22"/>
+                <w:szCs w:val="22"/>
               </w:rPr>
             </w:pPr>
             <w:r>
               <w:rPr>
                 <w:rFonts w:ascii="Times New Roman" w:hAnsi="Times New Roman" w:cs="Times New Roman"/>
-                <w:sz w:val="20"/>
-                <w:szCs w:val="20"/>
+                <w:sz w:val="22"/>
+                <w:szCs w:val="22"/>
               </w:rPr>
               <w:t>worked on string content and recovering acceptance rate</w:t>
             </w:r>
@@ -1540,8 +1681,8 @@
         <w:jc w:val="both"/>
         <w:rPr>
           <w:rFonts w:ascii="Times New Roman" w:hAnsi="Times New Roman" w:cs="Times New Roman"/>
-          <w:sz w:val="20"/>
-          <w:szCs w:val="20"/>
+          <w:sz w:val="22"/>
+          <w:szCs w:val="22"/>
         </w:rPr>
       </w:pPr>
     </w:p>
@@ -1551,17 +1692,33 @@
         <w:jc w:val="both"/>
         <w:rPr>
           <w:rFonts w:ascii="Times New Roman" w:hAnsi="Times New Roman" w:cs="Times New Roman"/>
-          <w:sz w:val="20"/>
-          <w:szCs w:val="20"/>
-        </w:rPr>
-      </w:pPr>
-      <w:r>
-        <w:rPr>
-          <w:rFonts w:ascii="Times New Roman" w:hAnsi="Times New Roman" w:cs="Times New Roman"/>
-          <w:sz w:val="20"/>
-          <w:szCs w:val="20"/>
-        </w:rPr>
-        <w:t>Iteration 0's 6.2% acceptance rate is a textbook example of the exact failure this whole approach is meant to catch. The first generator added an unlimited nesting draw inside every single document, so roughly 40% of otherwise normal documents got dragged down and rejected because of one runaway field. This is the kind of "generator that's mostly getting rejected" case the assignment specifically asks about, and it happened here rather than on the JSON side. From the acceptance number alone, iteration 1 figured out the problem, gave deep nesting its own separate strategy instead of mixing it into every document, and acceptance jumped to 43% in one round. That was more literally "alone" than I knew at the time. Reviewing the code after the run, I found the harness was discarding tomlc99's error messages, so the model never saw a single parser rejection for this target and had nothing but the acceptance rate to reason from.</w:t>
+          <w:sz w:val="22"/>
+          <w:szCs w:val="22"/>
+        </w:rPr>
+      </w:pPr>
+      <w:r>
+        <w:rPr>
+          <w:rFonts w:ascii="Times New Roman" w:hAnsi="Times New Roman" w:cs="Times New Roman"/>
+          <w:sz w:val="22"/>
+          <w:szCs w:val="22"/>
+        </w:rPr>
+        <w:t>Iteration 0's 6.2% acceptance rate is a textbook example of the exact failure this whole approach is meant to catch. The first generator added an unlimited nesting draw inside every single document, so roughly 40% of otherwise normal documents got dragged down and rejected because of one runaway field. This is the kind of "generator that's mostly getting rejected" case the assignment specifically asks about</w:t>
+      </w:r>
+      <w:r>
+        <w:rPr>
+          <w:rFonts w:ascii="Times New Roman" w:hAnsi="Times New Roman" w:cs="Times New Roman"/>
+          <w:sz w:val="22"/>
+          <w:szCs w:val="22"/>
+        </w:rPr>
+        <w:t>.</w:t>
+      </w:r>
+      <w:r>
+        <w:rPr>
+          <w:rFonts w:ascii="Times New Roman" w:hAnsi="Times New Roman" w:cs="Times New Roman"/>
+          <w:sz w:val="22"/>
+          <w:szCs w:val="22"/>
+        </w:rPr>
+        <w:t xml:space="preserve"> From the acceptance number alone, iteration 1 figured out the problem, gave deep nesting its own separate strategy instead of mixing it into every document, and acceptance jumped to 43% in one round. Reviewing the code after the run, I found the harness was discarding tomlc99's error messages, so the model never saw a single parser rejection for this target and had nothing but the acceptance rate to reason from.</w:t>
       </w:r>
     </w:p>
     <w:p>
@@ -1570,39 +1727,39 @@
         <w:jc w:val="both"/>
         <w:rPr>
           <w:rFonts w:ascii="Times New Roman" w:hAnsi="Times New Roman" w:cs="Times New Roman"/>
-          <w:sz w:val="20"/>
-          <w:szCs w:val="20"/>
-        </w:rPr>
-      </w:pPr>
-      <w:r>
-        <w:rPr>
-          <w:rFonts w:ascii="Times New Roman" w:hAnsi="Times New Roman" w:cs="Times New Roman"/>
-          <w:sz w:val="20"/>
-          <w:szCs w:val="20"/>
+          <w:sz w:val="22"/>
+          <w:szCs w:val="22"/>
+        </w:rPr>
+      </w:pPr>
+      <w:r>
+        <w:rPr>
+          <w:rFonts w:ascii="Times New Roman" w:hAnsi="Times New Roman" w:cs="Times New Roman"/>
+          <w:sz w:val="22"/>
+          <w:szCs w:val="22"/>
         </w:rPr>
         <w:t xml:space="preserve">After that, the loop did what I'd hoped it would. Iteration 2 found the crash and immediately backed off how hard it pushed nesting, </w:t>
       </w:r>
       <w:r>
         <w:rPr>
           <w:rFonts w:ascii="Times New Roman" w:hAnsi="Times New Roman" w:cs="Times New Roman"/>
-          <w:sz w:val="20"/>
-          <w:szCs w:val="20"/>
+          <w:sz w:val="22"/>
+          <w:szCs w:val="22"/>
         </w:rPr>
         <w:t>since a bug that's already reproducible doesn't need more pressure behind it</w:t>
       </w:r>
       <w:r>
         <w:rPr>
           <w:rFonts w:ascii="Times New Roman" w:hAnsi="Times New Roman" w:cs="Times New Roman"/>
-          <w:sz w:val="20"/>
-          <w:szCs w:val="20"/>
+          <w:sz w:val="22"/>
+          <w:szCs w:val="22"/>
         </w:rPr>
         <w:t xml:space="preserve">. Iterations 3 and 4 spent the rest of the budget improving acceptance and testing string content at the byte level, following the note in </w:t>
       </w:r>
       <w:r>
         <w:rPr>
           <w:rFonts w:ascii="Times New Roman" w:eastAsia="Consolas" w:hAnsi="Times New Roman" w:cs="Times New Roman"/>
-          <w:sz w:val="20"/>
-          <w:szCs w:val="20"/>
+          <w:sz w:val="22"/>
+          <w:szCs w:val="22"/>
           <w:shd w:val="clear" w:color="auto" w:fill="F0F0F0"/>
         </w:rPr>
         <w:t>ADAPTATIONS.md</w:t>
@@ -1610,8 +1767,8 @@
       <w:r>
         <w:rPr>
           <w:rFonts w:ascii="Times New Roman" w:hAnsi="Times New Roman" w:cs="Times New Roman"/>
-          <w:sz w:val="20"/>
-          <w:szCs w:val="20"/>
+          <w:sz w:val="22"/>
+          <w:szCs w:val="22"/>
         </w:rPr>
         <w:t xml:space="preserve"> that tomlc99 already handles numbers carefully, so that wasn't worth spending more budget on.</w:t>
       </w:r>
@@ -1623,15 +1780,15 @@
         <w:jc w:val="both"/>
         <w:rPr>
           <w:rFonts w:ascii="Times New Roman" w:hAnsi="Times New Roman" w:cs="Times New Roman"/>
-          <w:sz w:val="24"/>
-          <w:szCs w:val="24"/>
-        </w:rPr>
-      </w:pPr>
-      <w:r>
-        <w:rPr>
-          <w:rFonts w:ascii="Times New Roman" w:hAnsi="Times New Roman" w:cs="Times New Roman"/>
-          <w:sz w:val="24"/>
-          <w:szCs w:val="24"/>
+          <w:sz w:val="22"/>
+          <w:szCs w:val="22"/>
+        </w:rPr>
+      </w:pPr>
+      <w:r>
+        <w:rPr>
+          <w:rFonts w:ascii="Times New Roman" w:hAnsi="Times New Roman" w:cs="Times New Roman"/>
+          <w:sz w:val="22"/>
+          <w:szCs w:val="22"/>
         </w:rPr>
         <w:t>Challenges specific to this target</w:t>
       </w:r>
@@ -1642,8 +1799,8 @@
         <w:jc w:val="both"/>
         <w:rPr>
           <w:rFonts w:ascii="Times New Roman" w:hAnsi="Times New Roman" w:cs="Times New Roman"/>
-          <w:sz w:val="20"/>
-          <w:szCs w:val="20"/>
+          <w:sz w:val="22"/>
+          <w:szCs w:val="22"/>
         </w:rPr>
       </w:pPr>
       <w:r>
@@ -1651,18 +1808,18 @@
           <w:rFonts w:ascii="Times New Roman" w:hAnsi="Times New Roman" w:cs="Times New Roman"/>
           <w:b/>
           <w:bCs/>
-          <w:sz w:val="20"/>
-          <w:szCs w:val="20"/>
+          <w:sz w:val="22"/>
+          <w:szCs w:val="22"/>
         </w:rPr>
         <w:t>A crash point that moves makes "found the bug" a probability, not a fact.</w:t>
       </w:r>
       <w:r>
         <w:rPr>
           <w:rFonts w:ascii="Times New Roman" w:hAnsi="Times New Roman" w:cs="Times New Roman"/>
-          <w:sz w:val="20"/>
-          <w:szCs w:val="20"/>
-        </w:rPr>
-        <w:t xml:space="preserve"> parson's nesting limit was exact and identical every time I tested it. tomlc99's crash depends on how the stack happens to be laid out on a given run, so saying "it crashes at depth X" is only true for that one run, not a fixed property of the bug. The pipeline handles this correctly, since it verifies before reporting and refuses to over-minimize, but it does change what the evidence actually proves.</w:t>
+          <w:sz w:val="22"/>
+          <w:szCs w:val="22"/>
+        </w:rPr>
+        <w:t xml:space="preserve"> parson's nesting limit was exact and identical every time I tested it. tomlc99's crash depends on how the stack happens to be laid out on a given run, so saying "it crashes at depth X" is only true for that one run, not a fixed property of the bug. The pipeline handles this, since it verifies before reporting and refuses to over-minimize, but it does change what the evidence actually proves.</w:t>
       </w:r>
     </w:p>
     <w:p>
@@ -1671,8 +1828,8 @@
         <w:jc w:val="both"/>
         <w:rPr>
           <w:rFonts w:ascii="Times New Roman" w:hAnsi="Times New Roman" w:cs="Times New Roman"/>
-          <w:sz w:val="20"/>
-          <w:szCs w:val="20"/>
+          <w:sz w:val="22"/>
+          <w:szCs w:val="22"/>
         </w:rPr>
       </w:pPr>
       <w:r>
@@ -1680,8 +1837,8 @@
           <w:rFonts w:ascii="Times New Roman" w:hAnsi="Times New Roman" w:cs="Times New Roman"/>
           <w:b/>
           <w:bCs/>
-          <w:sz w:val="20"/>
-          <w:szCs w:val="20"/>
+          <w:sz w:val="22"/>
+          <w:szCs w:val="22"/>
         </w:rPr>
         <w:t>The</w:t>
       </w:r>
@@ -1690,8 +1847,8 @@
           <w:rFonts w:ascii="Times New Roman" w:hAnsi="Times New Roman" w:cs="Times New Roman"/>
           <w:b/>
           <w:bCs/>
-          <w:sz w:val="20"/>
-          <w:szCs w:val="20"/>
+          <w:sz w:val="22"/>
+          <w:szCs w:val="22"/>
         </w:rPr>
         <w:t xml:space="preserve"> crash-grouping method really does </w:t>
       </w:r>
@@ -1700,8 +1857,8 @@
           <w:rFonts w:ascii="Times New Roman" w:hAnsi="Times New Roman" w:cs="Times New Roman"/>
           <w:b/>
           <w:bCs/>
-          <w:sz w:val="20"/>
-          <w:szCs w:val="20"/>
+          <w:sz w:val="22"/>
+          <w:szCs w:val="22"/>
         </w:rPr>
         <w:t>overcount</w:t>
       </w:r>
@@ -1710,16 +1867,16 @@
           <w:rFonts w:ascii="Times New Roman" w:hAnsi="Times New Roman" w:cs="Times New Roman"/>
           <w:b/>
           <w:bCs/>
-          <w:sz w:val="20"/>
-          <w:szCs w:val="20"/>
+          <w:sz w:val="22"/>
+          <w:szCs w:val="22"/>
         </w:rPr>
         <w:t>.</w:t>
       </w:r>
       <w:r>
         <w:rPr>
           <w:rFonts w:ascii="Times New Roman" w:hAnsi="Times New Roman" w:cs="Times New Roman"/>
-          <w:sz w:val="20"/>
-          <w:szCs w:val="20"/>
+          <w:sz w:val="22"/>
+          <w:szCs w:val="22"/>
         </w:rPr>
         <w:t xml:space="preserve"> I deliberately didn't fix this here, because adjusting the grouping logic after already knowing the answer would be circular reasoning. The honest fix for later would be a second grouping pass that also checks whether the sanitizer error type matches and whether one function dominates the stack, which would correctly merge all four signatures into one.</w:t>
       </w:r>
@@ -1730,37 +1887,8 @@
         <w:jc w:val="both"/>
         <w:rPr>
           <w:rFonts w:ascii="Times New Roman" w:hAnsi="Times New Roman" w:cs="Times New Roman"/>
-          <w:sz w:val="20"/>
-          <w:szCs w:val="20"/>
-        </w:rPr>
-      </w:pPr>
-      <w:r>
-        <w:rPr>
-          <w:rFonts w:ascii="Times New Roman" w:hAnsi="Times New Roman" w:cs="Times New Roman"/>
-          <w:b/>
-          <w:bCs/>
-          <w:sz w:val="20"/>
-          <w:szCs w:val="20"/>
-        </w:rPr>
-        <w:t>This run cost more than the JSON one</w:t>
-      </w:r>
-      <w:r>
-        <w:rPr>
-          <w:rFonts w:ascii="Times New Roman" w:hAnsi="Times New Roman" w:cs="Times New Roman"/>
-          <w:sz w:val="20"/>
-          <w:szCs w:val="20"/>
-        </w:rPr>
-        <w:t>, $2.76 versus $0.86, almost entirely from one $0.72 call in iteration 2, whose 157,000-token prompt carried the previous iteration's full strategy code plus several large crash inputs. A future version should shorten those before feeding them back in.</w:t>
-      </w:r>
-    </w:p>
-    <w:p>
-      <w:pPr>
-        <w:spacing w:after="100"/>
-        <w:jc w:val="both"/>
-        <w:rPr>
-          <w:rFonts w:ascii="Times New Roman" w:hAnsi="Times New Roman" w:cs="Times New Roman"/>
-          <w:sz w:val="20"/>
-          <w:szCs w:val="20"/>
+          <w:sz w:val="22"/>
+          <w:szCs w:val="22"/>
         </w:rPr>
       </w:pPr>
       <w:r>
@@ -1768,8 +1896,8 @@
           <w:rFonts w:ascii="Times New Roman" w:hAnsi="Times New Roman" w:cs="Times New Roman"/>
           <w:i/>
           <w:iCs/>
-          <w:sz w:val="20"/>
-          <w:szCs w:val="20"/>
+          <w:sz w:val="22"/>
+          <w:szCs w:val="22"/>
         </w:rPr>
         <w:t xml:space="preserve">Artifacts under </w:t>
       </w:r>
@@ -1778,8 +1906,8 @@
           <w:rFonts w:ascii="Times New Roman" w:eastAsia="Consolas" w:hAnsi="Times New Roman" w:cs="Times New Roman"/>
           <w:i/>
           <w:iCs/>
-          <w:sz w:val="20"/>
-          <w:szCs w:val="20"/>
+          <w:sz w:val="22"/>
+          <w:szCs w:val="22"/>
           <w:shd w:val="clear" w:color="auto" w:fill="F0F0F0"/>
         </w:rPr>
         <w:t>toml-tomlc99/</w:t>
@@ -1789,8 +1917,8 @@
           <w:rFonts w:ascii="Times New Roman" w:hAnsi="Times New Roman" w:cs="Times New Roman"/>
           <w:i/>
           <w:iCs/>
-          <w:sz w:val="20"/>
-          <w:szCs w:val="20"/>
+          <w:sz w:val="22"/>
+          <w:szCs w:val="22"/>
         </w:rPr>
         <w:t xml:space="preserve">: </w:t>
       </w:r>
@@ -1799,8 +1927,8 @@
           <w:rFonts w:ascii="Times New Roman" w:eastAsia="Consolas" w:hAnsi="Times New Roman" w:cs="Times New Roman"/>
           <w:i/>
           <w:iCs/>
-          <w:sz w:val="20"/>
-          <w:szCs w:val="20"/>
+          <w:sz w:val="22"/>
+          <w:szCs w:val="22"/>
           <w:shd w:val="clear" w:color="auto" w:fill="F0F0F0"/>
         </w:rPr>
         <w:t>grammar/</w:t>
@@ -1810,8 +1938,8 @@
           <w:rFonts w:ascii="Times New Roman" w:hAnsi="Times New Roman" w:cs="Times New Roman"/>
           <w:i/>
           <w:iCs/>
-          <w:sz w:val="20"/>
-          <w:szCs w:val="20"/>
+          <w:sz w:val="22"/>
+          <w:szCs w:val="22"/>
         </w:rPr>
         <w:t xml:space="preserve">, </w:t>
       </w:r>
@@ -1820,8 +1948,8 @@
           <w:rFonts w:ascii="Times New Roman" w:eastAsia="Consolas" w:hAnsi="Times New Roman" w:cs="Times New Roman"/>
           <w:i/>
           <w:iCs/>
-          <w:sz w:val="20"/>
-          <w:szCs w:val="20"/>
+          <w:sz w:val="22"/>
+          <w:szCs w:val="22"/>
           <w:shd w:val="clear" w:color="auto" w:fill="F0F0F0"/>
         </w:rPr>
         <w:t>target/</w:t>
@@ -1831,8 +1959,8 @@
           <w:rFonts w:ascii="Times New Roman" w:hAnsi="Times New Roman" w:cs="Times New Roman"/>
           <w:i/>
           <w:iCs/>
-          <w:sz w:val="20"/>
-          <w:szCs w:val="20"/>
+          <w:sz w:val="22"/>
+          <w:szCs w:val="22"/>
         </w:rPr>
         <w:t xml:space="preserve">, </w:t>
       </w:r>
@@ -1841,8 +1969,8 @@
           <w:rFonts w:ascii="Times New Roman" w:eastAsia="Consolas" w:hAnsi="Times New Roman" w:cs="Times New Roman"/>
           <w:i/>
           <w:iCs/>
-          <w:sz w:val="20"/>
-          <w:szCs w:val="20"/>
+          <w:sz w:val="22"/>
+          <w:szCs w:val="22"/>
           <w:shd w:val="clear" w:color="auto" w:fill="F0F0F0"/>
         </w:rPr>
         <w:t>strategies/</w:t>
@@ -1852,8 +1980,8 @@
           <w:rFonts w:ascii="Times New Roman" w:hAnsi="Times New Roman" w:cs="Times New Roman"/>
           <w:i/>
           <w:iCs/>
-          <w:sz w:val="20"/>
-          <w:szCs w:val="20"/>
+          <w:sz w:val="22"/>
+          <w:szCs w:val="22"/>
         </w:rPr>
         <w:t xml:space="preserve">, </w:t>
       </w:r>
@@ -1862,8 +1990,8 @@
           <w:rFonts w:ascii="Times New Roman" w:eastAsia="Consolas" w:hAnsi="Times New Roman" w:cs="Times New Roman"/>
           <w:i/>
           <w:iCs/>
-          <w:sz w:val="20"/>
-          <w:szCs w:val="20"/>
+          <w:sz w:val="22"/>
+          <w:szCs w:val="22"/>
           <w:shd w:val="clear" w:color="auto" w:fill="F0F0F0"/>
         </w:rPr>
         <w:t>logs/</w:t>
@@ -1873,8 +2001,8 @@
           <w:rFonts w:ascii="Times New Roman" w:hAnsi="Times New Roman" w:cs="Times New Roman"/>
           <w:i/>
           <w:iCs/>
-          <w:sz w:val="20"/>
-          <w:szCs w:val="20"/>
+          <w:sz w:val="22"/>
+          <w:szCs w:val="22"/>
         </w:rPr>
         <w:t xml:space="preserve">, </w:t>
       </w:r>
@@ -1883,8 +2011,8 @@
           <w:rFonts w:ascii="Times New Roman" w:eastAsia="Consolas" w:hAnsi="Times New Roman" w:cs="Times New Roman"/>
           <w:i/>
           <w:iCs/>
-          <w:sz w:val="20"/>
-          <w:szCs w:val="20"/>
+          <w:sz w:val="22"/>
+          <w:szCs w:val="22"/>
           <w:shd w:val="clear" w:color="auto" w:fill="F0F0F0"/>
         </w:rPr>
         <w:t>crashes/</w:t>
@@ -1894,8 +2022,8 @@
           <w:rFonts w:ascii="Times New Roman" w:hAnsi="Times New Roman" w:cs="Times New Roman"/>
           <w:i/>
           <w:iCs/>
-          <w:sz w:val="20"/>
-          <w:szCs w:val="20"/>
+          <w:sz w:val="22"/>
+          <w:szCs w:val="22"/>
         </w:rPr>
         <w:t>.</w:t>
       </w:r>
@@ -2767,6 +2895,18 @@
       <w:szCs w:val="20"/>
     </w:rPr>
   </w:style>
+  <w:style w:type="character" w:styleId="FollowedHyperlink">
+    <w:name w:val="FollowedHyperlink"/>
+    <w:basedOn w:val="DefaultParagraphFont"/>
+    <w:uiPriority w:val="99"/>
+    <w:semiHidden/>
+    <w:unhideWhenUsed/>
+    <w:rsid w:val="0019055E"/>
+    <w:rPr>
+      <w:color w:val="96607D" w:themeColor="followedHyperlink"/>
+      <w:u w:val="single"/>
+    </w:rPr>
+  </w:style>
 </w:styles>
 </file>
 

</xml_diff>

<commit_message>
docs: cite prior upstream reports of the tomlc99 stack-overflow bug
Marcelo asked whether the bug was reported upstream. It wasn't, by me,
but checking turned up two existing reports of the identical recursion
(issues #95 and #97 on cktan/tomlc99), which is a stronger result than
a fresh report would have been: the pipeline rediscovered a real,
already-confirmed vulnerability with no prior knowledge of either.

Added as a linked citation right after the four-signatures-one-bug
paragraph in both the docx (proper hyperlinks, matching the existing
link style) and the markdown. Still two pages, zero em dashes, schema
validated.
</commit_message>
<xml_diff>
--- a/report/report-toml-tomlc99.docx
+++ b/report/report-toml-tomlc99.docx
@@ -816,6 +816,65 @@
           <w:szCs w:val="22"/>
         </w:rPr>
         <w:t>.</w:t>
+      </w:r>
+    </w:p>
+    <w:p>
+      <w:pPr>
+        <w:spacing w:after="100"/>
+        <w:jc w:val="both"/>
+        <w:rPr>
+          <w:rFonts w:ascii="Times New Roman" w:hAnsi="Times New Roman" w:cs="Times New Roman"/>
+          <w:sz w:val="22"/>
+          <w:szCs w:val="22"/>
+        </w:rPr>
+      </w:pPr>
+      <w:r>
+        <w:rPr>
+          <w:rFonts w:ascii="Times New Roman" w:hAnsi="Times New Roman" w:cs="Times New Roman"/>
+          <w:sz w:val="22"/>
+          <w:szCs w:val="22"/>
+        </w:rPr>
+        <w:t xml:space="preserve">This root cause is already known: </w:t>
+      </w:r>
+      <w:hyperlink r:id="rIdIssue95" w:history="1">
+        <w:r>
+          <w:rPr>
+            <w:rStyle w:val="Hyperlink"/>
+            <w:rFonts w:ascii="Times New Roman" w:hAnsi="Times New Roman" w:cs="Times New Roman"/>
+            <w:color w:val="0070C0"/>
+            <w:sz w:val="22"/>
+            <w:szCs w:val="22"/>
+          </w:rPr>
+          <w:t>issue #95</w:t>
+        </w:r>
+      </w:hyperlink>
+      <w:r>
+        <w:rPr>
+          <w:rFonts w:ascii="Times New Roman" w:hAnsi="Times New Roman" w:cs="Times New Roman"/>
+          <w:sz w:val="22"/>
+          <w:szCs w:val="22"/>
+        </w:rPr>
+        <w:t xml:space="preserve"> and </w:t>
+      </w:r>
+      <w:hyperlink r:id="rIdIssue97" w:history="1">
+        <w:r>
+          <w:rPr>
+            <w:rStyle w:val="Hyperlink"/>
+            <w:rFonts w:ascii="Times New Roman" w:hAnsi="Times New Roman" w:cs="Times New Roman"/>
+            <w:color w:val="0070C0"/>
+            <w:sz w:val="22"/>
+            <w:szCs w:val="22"/>
+          </w:rPr>
+          <w:t>issue #97</w:t>
+        </w:r>
+      </w:hyperlink>
+      <w:r>
+        <w:rPr>
+          <w:rFonts w:ascii="Times New Roman" w:hAnsi="Times New Roman" w:cs="Times New Roman"/>
+          <w:sz w:val="22"/>
+          <w:szCs w:val="22"/>
+        </w:rPr>
+        <w:t xml:space="preserve"> independently report the same recursion in parse_array and parse_keyval, stronger corroboration than a novel finding.</w:t>
       </w:r>
     </w:p>
     <w:p>

</xml_diff>